<commit_message>
chingo de cosas w
</commit_message>
<xml_diff>
--- a/TAREAS 6 SEMESTRE/Programación Paralela y en Tiempo Real/QuijasContreras_EstructuraComputadora_Act4.docx
+++ b/TAREAS 6 SEMESTRE/Programación Paralela y en Tiempo Real/QuijasContreras_EstructuraComputadora_Act4.docx
@@ -262,15 +262,15 @@
         <mc:AlternateContent>
           <mc:Choice Requires="wps">
             <w:drawing>
-              <wp:anchor distT="0" distB="0" distL="114300" distR="114300" simplePos="0" relativeHeight="251657728" behindDoc="0" locked="0" layoutInCell="1" allowOverlap="1" wp14:anchorId="12F471F9" wp14:editId="4566EB5C">
+              <wp:anchor distT="0" distB="0" distL="114300" distR="114300" simplePos="0" relativeHeight="251657728" behindDoc="0" locked="0" layoutInCell="1" allowOverlap="1" wp14:anchorId="12F471F9" wp14:editId="6BC07F20">
                 <wp:simplePos x="0" y="0"/>
                 <wp:positionH relativeFrom="margin">
-                  <wp:posOffset>-15240</wp:posOffset>
+                  <wp:posOffset>-13335</wp:posOffset>
                 </wp:positionH>
                 <wp:positionV relativeFrom="paragraph">
-                  <wp:posOffset>290195</wp:posOffset>
+                  <wp:posOffset>135255</wp:posOffset>
                 </wp:positionV>
-                <wp:extent cx="5347335" cy="857250"/>
+                <wp:extent cx="5347335" cy="1320800"/>
                 <wp:effectExtent l="0" t="0" r="0" b="0"/>
                 <wp:wrapNone/>
                 <wp:docPr id="1111212547" name="Cuadro de texto 281"/>
@@ -282,7 +282,7 @@
                       <wps:spPr>
                         <a:xfrm>
                           <a:off x="0" y="0"/>
-                          <a:ext cx="5347335" cy="857250"/>
+                          <a:ext cx="5347335" cy="1320800"/>
                         </a:xfrm>
                         <a:prstGeom prst="rect">
                           <a:avLst/>
@@ -309,7 +309,7 @@
                                 <w:sz w:val="72"/>
                                 <w:szCs w:val="96"/>
                               </w:rPr>
-                              <w:t>Memorias</w:t>
+                              <w:t>Estructura Básica de una Computadora</w:t>
                             </w:r>
                           </w:p>
                         </w:txbxContent>
@@ -338,7 +338,7 @@
                 <v:stroke joinstyle="miter"/>
                 <v:path gradientshapeok="t" o:connecttype="rect"/>
               </v:shapetype>
-              <v:shape id="Cuadro de texto 281" o:spid="_x0000_s1026" type="#_x0000_t202" style="position:absolute;left:0;text-align:left;margin-left:-1.2pt;margin-top:22.85pt;width:421.05pt;height:67.5pt;z-index:251657728;visibility:visible;mso-wrap-style:square;mso-width-percent:0;mso-height-percent:0;mso-wrap-distance-left:9pt;mso-wrap-distance-top:0;mso-wrap-distance-right:9pt;mso-wrap-distance-bottom:0;mso-position-horizontal:absolute;mso-position-horizontal-relative:margin;mso-position-vertical:absolute;mso-position-vertical-relative:text;mso-width-percent:0;mso-height-percent:0;mso-width-relative:margin;mso-height-relative:margin;v-text-anchor:top" o:gfxdata="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" filled="f" stroked="f" strokeweight="4.5pt">
+              <v:shape id="Cuadro de texto 281" o:spid="_x0000_s1026" type="#_x0000_t202" style="position:absolute;left:0;text-align:left;margin-left:-1.05pt;margin-top:10.65pt;width:421.05pt;height:104pt;z-index:251657728;visibility:visible;mso-wrap-style:square;mso-width-percent:0;mso-height-percent:0;mso-wrap-distance-left:9pt;mso-wrap-distance-top:0;mso-wrap-distance-right:9pt;mso-wrap-distance-bottom:0;mso-position-horizontal:absolute;mso-position-horizontal-relative:margin;mso-position-vertical:absolute;mso-position-vertical-relative:text;mso-width-percent:0;mso-height-percent:0;mso-width-relative:margin;mso-height-relative:margin;v-text-anchor:top" o:gfxdata="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" filled="f" stroked="f" strokeweight="4.5pt">
                 <v:textbox>
                   <w:txbxContent>
                     <w:p>
@@ -356,7 +356,7 @@
                           <w:sz w:val="72"/>
                           <w:szCs w:val="96"/>
                         </w:rPr>
-                        <w:t>Memorias</w:t>
+                        <w:t>Estructura Básica de una Computadora</w:t>
                       </w:r>
                     </w:p>
                   </w:txbxContent>
@@ -587,11 +587,7 @@
           </mc:Choice>
           <mc:Fallback>
             <w:pict>
-              <v:shapetype w14:anchorId="5D1D070E" id="_x0000_t202" coordsize="21600,21600" o:spt="202" path="m,l,21600r21600,l21600,xe">
-                <v:stroke joinstyle="miter"/>
-                <v:path gradientshapeok="t" o:connecttype="rect"/>
-              </v:shapetype>
-              <v:shape id="Cuadro de texto 282" o:spid="_x0000_s1027" type="#_x0000_t202" style="position:absolute;left:0;text-align:left;margin-left:126.4pt;margin-top:20.95pt;width:332.35pt;height:31.75pt;z-index:251659776;visibility:visible;mso-wrap-style:square;mso-width-percent:0;mso-height-percent:0;mso-wrap-distance-left:9pt;mso-wrap-distance-top:0;mso-wrap-distance-right:9pt;mso-wrap-distance-bottom:0;mso-position-horizontal:absolute;mso-position-horizontal-relative:page;mso-position-vertical:absolute;mso-position-vertical-relative:text;mso-width-percent:0;mso-height-percent:0;mso-width-relative:margin;mso-height-relative:margin;v-text-anchor:top" o:gfxdata="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" filled="f" stroked="f" strokeweight=".5pt">
+              <v:shape w14:anchorId="5D1D070E" id="Cuadro de texto 282" o:spid="_x0000_s1027" type="#_x0000_t202" style="position:absolute;left:0;text-align:left;margin-left:126.4pt;margin-top:20.95pt;width:332.35pt;height:31.75pt;z-index:251659776;visibility:visible;mso-wrap-style:square;mso-width-percent:0;mso-height-percent:0;mso-wrap-distance-left:9pt;mso-wrap-distance-top:0;mso-wrap-distance-right:9pt;mso-wrap-distance-bottom:0;mso-position-horizontal:absolute;mso-position-horizontal-relative:page;mso-position-vertical:absolute;mso-position-vertical-relative:text;mso-width-percent:0;mso-height-percent:0;mso-width-relative:margin;mso-height-relative:margin;v-text-anchor:top" o:gfxdata="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" filled="f" stroked="f" strokeweight=".5pt">
                 <v:textbox>
                   <w:txbxContent>
                     <w:p>
@@ -775,7 +771,7 @@
                                 <w:sz w:val="36"/>
                                 <w:szCs w:val="22"/>
                               </w:rPr>
-                              <w:t>3</w:t>
+                              <w:t>4</w:t>
                             </w:r>
                           </w:p>
                         </w:txbxContent>
@@ -816,7 +812,7 @@
                           <w:sz w:val="36"/>
                           <w:szCs w:val="22"/>
                         </w:rPr>
-                        <w:t>3</w:t>
+                        <w:t>4</w:t>
                       </w:r>
                     </w:p>
                   </w:txbxContent>
@@ -1201,23 +1197,7 @@
                                 <w:sz w:val="40"/>
                                 <w:szCs w:val="44"/>
                               </w:rPr>
-                              <w:t>3</w:t>
-                            </w:r>
-                            <w:r>
-                              <w:rPr>
-                                <w:rFonts w:asciiTheme="majorHAnsi" w:hAnsiTheme="majorHAnsi" w:cstheme="majorHAnsi"/>
-                                <w:sz w:val="40"/>
-                                <w:szCs w:val="44"/>
-                              </w:rPr>
-                              <w:t>1/0</w:t>
-                            </w:r>
-                            <w:r>
-                              <w:rPr>
-                                <w:rFonts w:asciiTheme="majorHAnsi" w:hAnsiTheme="majorHAnsi" w:cstheme="majorHAnsi"/>
-                                <w:sz w:val="40"/>
-                                <w:szCs w:val="44"/>
-                              </w:rPr>
-                              <w:t>8</w:t>
+                              <w:t>09/09</w:t>
                             </w:r>
                             <w:r>
                               <w:rPr>
@@ -1419,23 +1399,7 @@
                           <w:sz w:val="40"/>
                           <w:szCs w:val="44"/>
                         </w:rPr>
-                        <w:t>3</w:t>
-                      </w:r>
-                      <w:r>
-                        <w:rPr>
-                          <w:rFonts w:asciiTheme="majorHAnsi" w:hAnsiTheme="majorHAnsi" w:cstheme="majorHAnsi"/>
-                          <w:sz w:val="40"/>
-                          <w:szCs w:val="44"/>
-                        </w:rPr>
-                        <w:t>1/0</w:t>
-                      </w:r>
-                      <w:r>
-                        <w:rPr>
-                          <w:rFonts w:asciiTheme="majorHAnsi" w:hAnsiTheme="majorHAnsi" w:cstheme="majorHAnsi"/>
-                          <w:sz w:val="40"/>
-                          <w:szCs w:val="44"/>
-                        </w:rPr>
-                        <w:t>8</w:t>
+                        <w:t>09/09</w:t>
                       </w:r>
                       <w:r>
                         <w:rPr>
@@ -1472,7 +1436,7 @@
         <w:br w:type="page"/>
       </w:r>
     </w:p>
-    <w:bookmarkStart w:id="0" w:name="_Toc220850609" w:displacedByCustomXml="next"/>
+    <w:bookmarkStart w:id="0" w:name="_Toc239866068" w:displacedByCustomXml="next"/>
     <w:sdt>
       <w:sdtPr>
         <w:rPr>
@@ -1539,7 +1503,7 @@
           <w:r>
             <w:fldChar w:fldCharType="separate"/>
           </w:r>
-          <w:hyperlink w:anchor="_Toc220850609" w:history="1">
+          <w:hyperlink w:anchor="_Toc239866068" w:history="1">
             <w:r>
               <w:rPr>
                 <w:rStyle w:val="Hipervnculo"/>
@@ -1567,7 +1531,7 @@
                 <w:noProof/>
                 <w:webHidden/>
               </w:rPr>
-              <w:instrText xml:space="preserve"> PAGEREF _Toc220850609 \h </w:instrText>
+              <w:instrText xml:space="preserve"> PAGEREF _Toc239866068 \h </w:instrText>
             </w:r>
             <w:r>
               <w:rPr>
@@ -1610,13 +1574,13 @@
               <w:color w:val="auto"/>
             </w:rPr>
           </w:pPr>
-          <w:hyperlink w:anchor="_Toc220850610" w:history="1">
+          <w:hyperlink w:anchor="_Toc239866069" w:history="1">
             <w:r>
               <w:rPr>
                 <w:rStyle w:val="Hipervnculo"/>
                 <w:noProof/>
               </w:rPr>
-              <w:t>Tabla de ilustraciones</w:t>
+              <w:t>Mis dispositivos</w:t>
             </w:r>
             <w:r>
               <w:rPr>
@@ -1637,7 +1601,7 @@
                 <w:noProof/>
                 <w:webHidden/>
               </w:rPr>
-              <w:instrText xml:space="preserve"> PAGEREF _Toc220850610 \h </w:instrText>
+              <w:instrText xml:space="preserve"> PAGEREF _Toc239866069 \h </w:instrText>
             </w:r>
             <w:r>
               <w:rPr>
@@ -1670,7 +1634,7 @@
         </w:p>
         <w:p>
           <w:pPr>
-            <w:pStyle w:val="TDC1"/>
+            <w:pStyle w:val="TDC2"/>
             <w:tabs>
               <w:tab w:val="right" w:leader="dot" w:pos="9111"/>
             </w:tabs>
@@ -1680,13 +1644,13 @@
               <w:color w:val="auto"/>
             </w:rPr>
           </w:pPr>
-          <w:hyperlink w:anchor="_Toc220850611" w:history="1">
+          <w:hyperlink w:anchor="_Toc239866070" w:history="1">
             <w:r>
               <w:rPr>
                 <w:rStyle w:val="Hipervnculo"/>
                 <w:noProof/>
               </w:rPr>
-              <w:t>Desarrollo</w:t>
+              <w:t>Dispositivos de entrada</w:t>
             </w:r>
             <w:r>
               <w:rPr>
@@ -1707,7 +1671,7 @@
                 <w:noProof/>
                 <w:webHidden/>
               </w:rPr>
-              <w:instrText xml:space="preserve"> PAGEREF _Toc220850611 \h </w:instrText>
+              <w:instrText xml:space="preserve"> PAGEREF _Toc239866070 \h </w:instrText>
             </w:r>
             <w:r>
               <w:rPr>
@@ -1740,7 +1704,7 @@
         </w:p>
         <w:p>
           <w:pPr>
-            <w:pStyle w:val="TDC1"/>
+            <w:pStyle w:val="TDC2"/>
             <w:tabs>
               <w:tab w:val="right" w:leader="dot" w:pos="9111"/>
             </w:tabs>
@@ -1750,13 +1714,13 @@
               <w:color w:val="auto"/>
             </w:rPr>
           </w:pPr>
-          <w:hyperlink w:anchor="_Toc220850612" w:history="1">
+          <w:hyperlink w:anchor="_Toc239866071" w:history="1">
             <w:r>
               <w:rPr>
                 <w:rStyle w:val="Hipervnculo"/>
                 <w:noProof/>
               </w:rPr>
-              <w:t>Conclusión</w:t>
+              <w:t>Dispositivos de salida</w:t>
             </w:r>
             <w:r>
               <w:rPr>
@@ -1777,7 +1741,7 @@
                 <w:noProof/>
                 <w:webHidden/>
               </w:rPr>
-              <w:instrText xml:space="preserve"> PAGEREF _Toc220850612 \h </w:instrText>
+              <w:instrText xml:space="preserve"> PAGEREF _Toc239866071 \h </w:instrText>
             </w:r>
             <w:r>
               <w:rPr>
@@ -1810,7 +1774,7 @@
         </w:p>
         <w:p>
           <w:pPr>
-            <w:pStyle w:val="TDC1"/>
+            <w:pStyle w:val="TDC2"/>
             <w:tabs>
               <w:tab w:val="right" w:leader="dot" w:pos="9111"/>
             </w:tabs>
@@ -1820,13 +1784,13 @@
               <w:color w:val="auto"/>
             </w:rPr>
           </w:pPr>
-          <w:hyperlink w:anchor="_Toc220850613" w:history="1">
+          <w:hyperlink w:anchor="_Toc239866072" w:history="1">
             <w:r>
               <w:rPr>
                 <w:rStyle w:val="Hipervnculo"/>
                 <w:noProof/>
               </w:rPr>
-              <w:t>Bibliografía</w:t>
+              <w:t>Dispositivos de almacenamiento</w:t>
             </w:r>
             <w:r>
               <w:rPr>
@@ -1847,7 +1811,7 @@
                 <w:noProof/>
                 <w:webHidden/>
               </w:rPr>
-              <w:instrText xml:space="preserve"> PAGEREF _Toc220850613 \h </w:instrText>
+              <w:instrText xml:space="preserve"> PAGEREF _Toc239866072 \h </w:instrText>
             </w:r>
             <w:r>
               <w:rPr>
@@ -1879,6 +1843,420 @@
           </w:hyperlink>
         </w:p>
         <w:p>
+          <w:pPr>
+            <w:pStyle w:val="TDC2"/>
+            <w:tabs>
+              <w:tab w:val="right" w:leader="dot" w:pos="9111"/>
+            </w:tabs>
+            <w:rPr>
+              <w:rFonts w:asciiTheme="minorHAnsi" w:eastAsiaTheme="minorEastAsia" w:hAnsiTheme="minorHAnsi" w:cstheme="minorBidi"/>
+              <w:noProof/>
+              <w:color w:val="auto"/>
+            </w:rPr>
+          </w:pPr>
+          <w:hyperlink w:anchor="_Toc239866073" w:history="1">
+            <w:r>
+              <w:rPr>
+                <w:rStyle w:val="Hipervnculo"/>
+                <w:noProof/>
+              </w:rPr>
+              <w:t>Dispositivos de computación</w:t>
+            </w:r>
+            <w:r>
+              <w:rPr>
+                <w:noProof/>
+                <w:webHidden/>
+              </w:rPr>
+              <w:tab/>
+            </w:r>
+            <w:r>
+              <w:rPr>
+                <w:noProof/>
+                <w:webHidden/>
+              </w:rPr>
+              <w:fldChar w:fldCharType="begin"/>
+            </w:r>
+            <w:r>
+              <w:rPr>
+                <w:noProof/>
+                <w:webHidden/>
+              </w:rPr>
+              <w:instrText xml:space="preserve"> PAGEREF _Toc239866073 \h </w:instrText>
+            </w:r>
+            <w:r>
+              <w:rPr>
+                <w:noProof/>
+                <w:webHidden/>
+              </w:rPr>
+            </w:r>
+            <w:r>
+              <w:rPr>
+                <w:noProof/>
+                <w:webHidden/>
+              </w:rPr>
+              <w:fldChar w:fldCharType="separate"/>
+            </w:r>
+            <w:r>
+              <w:rPr>
+                <w:noProof/>
+                <w:webHidden/>
+              </w:rPr>
+              <w:t>1</w:t>
+            </w:r>
+            <w:r>
+              <w:rPr>
+                <w:noProof/>
+                <w:webHidden/>
+              </w:rPr>
+              <w:fldChar w:fldCharType="end"/>
+            </w:r>
+          </w:hyperlink>
+        </w:p>
+        <w:p>
+          <w:pPr>
+            <w:pStyle w:val="TDC2"/>
+            <w:tabs>
+              <w:tab w:val="right" w:leader="dot" w:pos="9111"/>
+            </w:tabs>
+            <w:rPr>
+              <w:rFonts w:asciiTheme="minorHAnsi" w:eastAsiaTheme="minorEastAsia" w:hAnsiTheme="minorHAnsi" w:cstheme="minorBidi"/>
+              <w:noProof/>
+              <w:color w:val="auto"/>
+            </w:rPr>
+          </w:pPr>
+          <w:hyperlink w:anchor="_Toc239866074" w:history="1">
+            <w:r>
+              <w:rPr>
+                <w:rStyle w:val="Hipervnculo"/>
+                <w:noProof/>
+              </w:rPr>
+              <w:t>Dispositivos de comunicación</w:t>
+            </w:r>
+            <w:r>
+              <w:rPr>
+                <w:noProof/>
+                <w:webHidden/>
+              </w:rPr>
+              <w:tab/>
+            </w:r>
+            <w:r>
+              <w:rPr>
+                <w:noProof/>
+                <w:webHidden/>
+              </w:rPr>
+              <w:fldChar w:fldCharType="begin"/>
+            </w:r>
+            <w:r>
+              <w:rPr>
+                <w:noProof/>
+                <w:webHidden/>
+              </w:rPr>
+              <w:instrText xml:space="preserve"> PAGEREF _Toc239866074 \h </w:instrText>
+            </w:r>
+            <w:r>
+              <w:rPr>
+                <w:noProof/>
+                <w:webHidden/>
+              </w:rPr>
+            </w:r>
+            <w:r>
+              <w:rPr>
+                <w:noProof/>
+                <w:webHidden/>
+              </w:rPr>
+              <w:fldChar w:fldCharType="separate"/>
+            </w:r>
+            <w:r>
+              <w:rPr>
+                <w:noProof/>
+                <w:webHidden/>
+              </w:rPr>
+              <w:t>2</w:t>
+            </w:r>
+            <w:r>
+              <w:rPr>
+                <w:noProof/>
+                <w:webHidden/>
+              </w:rPr>
+              <w:fldChar w:fldCharType="end"/>
+            </w:r>
+          </w:hyperlink>
+        </w:p>
+        <w:p>
+          <w:pPr>
+            <w:pStyle w:val="TDC2"/>
+            <w:tabs>
+              <w:tab w:val="right" w:leader="dot" w:pos="9111"/>
+            </w:tabs>
+            <w:rPr>
+              <w:rFonts w:asciiTheme="minorHAnsi" w:eastAsiaTheme="minorEastAsia" w:hAnsiTheme="minorHAnsi" w:cstheme="minorBidi"/>
+              <w:noProof/>
+              <w:color w:val="auto"/>
+            </w:rPr>
+          </w:pPr>
+          <w:hyperlink w:anchor="_Toc239866075" w:history="1">
+            <w:r>
+              <w:rPr>
+                <w:rStyle w:val="Hipervnculo"/>
+                <w:noProof/>
+              </w:rPr>
+              <w:t>Software</w:t>
+            </w:r>
+            <w:r>
+              <w:rPr>
+                <w:noProof/>
+                <w:webHidden/>
+              </w:rPr>
+              <w:tab/>
+            </w:r>
+            <w:r>
+              <w:rPr>
+                <w:noProof/>
+                <w:webHidden/>
+              </w:rPr>
+              <w:fldChar w:fldCharType="begin"/>
+            </w:r>
+            <w:r>
+              <w:rPr>
+                <w:noProof/>
+                <w:webHidden/>
+              </w:rPr>
+              <w:instrText xml:space="preserve"> PAGEREF _Toc239866075 \h </w:instrText>
+            </w:r>
+            <w:r>
+              <w:rPr>
+                <w:noProof/>
+                <w:webHidden/>
+              </w:rPr>
+            </w:r>
+            <w:r>
+              <w:rPr>
+                <w:noProof/>
+                <w:webHidden/>
+              </w:rPr>
+              <w:fldChar w:fldCharType="separate"/>
+            </w:r>
+            <w:r>
+              <w:rPr>
+                <w:noProof/>
+                <w:webHidden/>
+              </w:rPr>
+              <w:t>2</w:t>
+            </w:r>
+            <w:r>
+              <w:rPr>
+                <w:noProof/>
+                <w:webHidden/>
+              </w:rPr>
+              <w:fldChar w:fldCharType="end"/>
+            </w:r>
+          </w:hyperlink>
+        </w:p>
+        <w:p>
+          <w:pPr>
+            <w:pStyle w:val="TDC3"/>
+            <w:tabs>
+              <w:tab w:val="right" w:leader="dot" w:pos="9111"/>
+            </w:tabs>
+            <w:rPr>
+              <w:noProof/>
+            </w:rPr>
+          </w:pPr>
+          <w:hyperlink w:anchor="_Toc239866076" w:history="1">
+            <w:r>
+              <w:rPr>
+                <w:rStyle w:val="Hipervnculo"/>
+                <w:noProof/>
+              </w:rPr>
+              <w:t>Software de sistema</w:t>
+            </w:r>
+            <w:r>
+              <w:rPr>
+                <w:noProof/>
+                <w:webHidden/>
+              </w:rPr>
+              <w:tab/>
+            </w:r>
+            <w:r>
+              <w:rPr>
+                <w:noProof/>
+                <w:webHidden/>
+              </w:rPr>
+              <w:fldChar w:fldCharType="begin"/>
+            </w:r>
+            <w:r>
+              <w:rPr>
+                <w:noProof/>
+                <w:webHidden/>
+              </w:rPr>
+              <w:instrText xml:space="preserve"> PAGEREF _Toc239866076 \h </w:instrText>
+            </w:r>
+            <w:r>
+              <w:rPr>
+                <w:noProof/>
+                <w:webHidden/>
+              </w:rPr>
+            </w:r>
+            <w:r>
+              <w:rPr>
+                <w:noProof/>
+                <w:webHidden/>
+              </w:rPr>
+              <w:fldChar w:fldCharType="separate"/>
+            </w:r>
+            <w:r>
+              <w:rPr>
+                <w:noProof/>
+                <w:webHidden/>
+              </w:rPr>
+              <w:t>2</w:t>
+            </w:r>
+            <w:r>
+              <w:rPr>
+                <w:noProof/>
+                <w:webHidden/>
+              </w:rPr>
+              <w:fldChar w:fldCharType="end"/>
+            </w:r>
+          </w:hyperlink>
+        </w:p>
+        <w:p>
+          <w:pPr>
+            <w:pStyle w:val="TDC3"/>
+            <w:tabs>
+              <w:tab w:val="right" w:leader="dot" w:pos="9111"/>
+            </w:tabs>
+            <w:rPr>
+              <w:noProof/>
+            </w:rPr>
+          </w:pPr>
+          <w:hyperlink w:anchor="_Toc239866077" w:history="1">
+            <w:r>
+              <w:rPr>
+                <w:rStyle w:val="Hipervnculo"/>
+                <w:noProof/>
+              </w:rPr>
+              <w:t>Software de programación</w:t>
+            </w:r>
+            <w:r>
+              <w:rPr>
+                <w:noProof/>
+                <w:webHidden/>
+              </w:rPr>
+              <w:tab/>
+            </w:r>
+            <w:r>
+              <w:rPr>
+                <w:noProof/>
+                <w:webHidden/>
+              </w:rPr>
+              <w:fldChar w:fldCharType="begin"/>
+            </w:r>
+            <w:r>
+              <w:rPr>
+                <w:noProof/>
+                <w:webHidden/>
+              </w:rPr>
+              <w:instrText xml:space="preserve"> PAGEREF _Toc239866077 \h </w:instrText>
+            </w:r>
+            <w:r>
+              <w:rPr>
+                <w:noProof/>
+                <w:webHidden/>
+              </w:rPr>
+            </w:r>
+            <w:r>
+              <w:rPr>
+                <w:noProof/>
+                <w:webHidden/>
+              </w:rPr>
+              <w:fldChar w:fldCharType="separate"/>
+            </w:r>
+            <w:r>
+              <w:rPr>
+                <w:noProof/>
+                <w:webHidden/>
+              </w:rPr>
+              <w:t>2</w:t>
+            </w:r>
+            <w:r>
+              <w:rPr>
+                <w:noProof/>
+                <w:webHidden/>
+              </w:rPr>
+              <w:fldChar w:fldCharType="end"/>
+            </w:r>
+          </w:hyperlink>
+        </w:p>
+        <w:p>
+          <w:pPr>
+            <w:pStyle w:val="TDC3"/>
+            <w:tabs>
+              <w:tab w:val="right" w:leader="dot" w:pos="9111"/>
+            </w:tabs>
+            <w:rPr>
+              <w:noProof/>
+            </w:rPr>
+          </w:pPr>
+          <w:hyperlink w:anchor="_Toc239866078" w:history="1">
+            <w:r>
+              <w:rPr>
+                <w:rStyle w:val="Hipervnculo"/>
+                <w:noProof/>
+              </w:rPr>
+              <w:t>Software de aplicación</w:t>
+            </w:r>
+            <w:r>
+              <w:rPr>
+                <w:noProof/>
+                <w:webHidden/>
+              </w:rPr>
+              <w:tab/>
+            </w:r>
+            <w:r>
+              <w:rPr>
+                <w:noProof/>
+                <w:webHidden/>
+              </w:rPr>
+              <w:fldChar w:fldCharType="begin"/>
+            </w:r>
+            <w:r>
+              <w:rPr>
+                <w:noProof/>
+                <w:webHidden/>
+              </w:rPr>
+              <w:instrText xml:space="preserve"> PAGEREF _Toc239866078 \h </w:instrText>
+            </w:r>
+            <w:r>
+              <w:rPr>
+                <w:noProof/>
+                <w:webHidden/>
+              </w:rPr>
+            </w:r>
+            <w:r>
+              <w:rPr>
+                <w:noProof/>
+                <w:webHidden/>
+              </w:rPr>
+              <w:fldChar w:fldCharType="separate"/>
+            </w:r>
+            <w:r>
+              <w:rPr>
+                <w:noProof/>
+                <w:webHidden/>
+              </w:rPr>
+              <w:t>2</w:t>
+            </w:r>
+            <w:r>
+              <w:rPr>
+                <w:noProof/>
+                <w:webHidden/>
+              </w:rPr>
+              <w:fldChar w:fldCharType="end"/>
+            </w:r>
+          </w:hyperlink>
+        </w:p>
+        <w:p>
           <w:r>
             <w:rPr>
               <w:b/>
@@ -1894,88 +2272,513 @@
       <w:pPr>
         <w:pStyle w:val="Ttulo1"/>
       </w:pPr>
-      <w:bookmarkStart w:id="1" w:name="_Toc220850610"/>
+      <w:bookmarkStart w:id="1" w:name="_Toc239866069"/>
       <w:r>
-        <w:t>Tabla de ilustraciones</w:t>
+        <w:t>Mis dispositivos</w:t>
       </w:r>
       <w:bookmarkEnd w:id="1"/>
     </w:p>
     <w:p>
-      <w:fldSimple w:instr=" TOC \h \z \c &quot;Ilustración&quot; ">
-        <w:r>
-          <w:rPr>
-            <w:b/>
-            <w:bCs/>
-            <w:noProof/>
-            <w:lang w:val="es-ES"/>
-          </w:rPr>
-          <w:t>No se encuentran elementos de tabla de ilustraciones.</w:t>
-        </w:r>
-      </w:fldSimple>
-    </w:p>
-    <w:p/>
-    <w:p>
-      <w:pPr>
-        <w:pStyle w:val="Ttulo1"/>
-      </w:pPr>
-      <w:bookmarkStart w:id="2" w:name="_Toc220850611"/>
+      <w:pPr>
+        <w:pStyle w:val="Ttulo2"/>
+      </w:pPr>
+      <w:bookmarkStart w:id="2" w:name="_Toc239866070"/>
       <w:r>
-        <w:t>Desarrollo</w:t>
+        <w:t>Dispositivos de entrada</w:t>
       </w:r>
       <w:bookmarkEnd w:id="2"/>
     </w:p>
     <w:p>
       <w:pPr>
-        <w:ind w:firstLine="708"/>
+        <w:pStyle w:val="Prrafodelista"/>
+        <w:numPr>
+          <w:ilvl w:val="0"/>
+          <w:numId w:val="33"/>
+        </w:numPr>
       </w:pPr>
       <w:r>
-        <w:t xml:space="preserve">Sangría siempre en la primera línea </w:t>
+        <w:t xml:space="preserve">Mouse </w:t>
+      </w:r>
+      <w:r>
+        <w:t xml:space="preserve">Razer Sensor óptico de 6400 dpi, </w:t>
+      </w:r>
+    </w:p>
+    <w:p>
+      <w:pPr>
+        <w:pStyle w:val="Prrafodelista"/>
+        <w:numPr>
+          <w:ilvl w:val="0"/>
+          <w:numId w:val="33"/>
+        </w:numPr>
+      </w:pPr>
+      <w:r>
+        <w:t xml:space="preserve">Teclado </w:t>
       </w:r>
       <w:proofErr w:type="spellStart"/>
       <w:r>
-        <w:t>blablablablablablabla</w:t>
+        <w:t>Hyp</w:t>
+      </w:r>
+      <w:r>
+        <w:t>erX</w:t>
       </w:r>
       <w:proofErr w:type="spellEnd"/>
       <w:r>
-        <w:t xml:space="preserve"> </w:t>
+        <w:t xml:space="preserve"> Alloy Core RGB, teclado de membrana con teclas silenciosas y rápidas con iluminación dinámica RGB.</w:t>
       </w:r>
     </w:p>
     <w:p>
+      <w:pPr>
+        <w:pStyle w:val="Ttulo2"/>
+      </w:pPr>
+      <w:bookmarkStart w:id="3" w:name="_Toc239866071"/>
       <w:r>
-        <w:t>Hola mundo</w:t>
-      </w:r>
-    </w:p>
-    <w:p>
-      <w:pPr>
-        <w:pStyle w:val="Ttulo1"/>
-      </w:pPr>
-      <w:bookmarkStart w:id="3" w:name="_Toc220850612"/>
-      <w:r>
-        <w:t>Conclusión</w:t>
+        <w:t>Dispositivos de salida</w:t>
       </w:r>
       <w:bookmarkEnd w:id="3"/>
     </w:p>
     <w:p>
       <w:pPr>
-        <w:spacing w:before="120" w:after="0"/>
+        <w:pStyle w:val="Prrafodelista"/>
+        <w:numPr>
+          <w:ilvl w:val="0"/>
+          <w:numId w:val="34"/>
+        </w:numPr>
       </w:pPr>
       <w:r>
-        <w:t>Hola soy una conclusión</w:t>
+        <w:t xml:space="preserve">Asus monitor curvo TUF </w:t>
+      </w:r>
+      <w:proofErr w:type="spellStart"/>
+      <w:r>
+        <w:t>Gaming</w:t>
+      </w:r>
+      <w:proofErr w:type="spellEnd"/>
+      <w:r>
+        <w:t xml:space="preserve"> 23.6” VG24VQE 1080P 165Hz</w:t>
       </w:r>
     </w:p>
     <w:p>
       <w:pPr>
-        <w:pStyle w:val="Ttulo1"/>
-      </w:pPr>
-      <w:bookmarkStart w:id="4" w:name="_Toc220850613"/>
+        <w:pStyle w:val="Prrafodelista"/>
+        <w:numPr>
+          <w:ilvl w:val="0"/>
+          <w:numId w:val="34"/>
+        </w:numPr>
+      </w:pPr>
       <w:r>
-        <w:t>Bibliografía</w:t>
+        <w:t>Aud</w:t>
+      </w:r>
+      <w:r>
+        <w:t>ífonos JBL con micrófono extraíble.</w:t>
+      </w:r>
+    </w:p>
+    <w:p>
+      <w:pPr>
+        <w:pStyle w:val="Ttulo2"/>
+      </w:pPr>
+      <w:bookmarkStart w:id="4" w:name="_Toc239866072"/>
+      <w:r>
+        <w:t>Dispositivos de almacenamiento</w:t>
       </w:r>
       <w:bookmarkEnd w:id="4"/>
     </w:p>
     <w:p>
+      <w:pPr>
+        <w:pStyle w:val="Prrafodelista"/>
+        <w:numPr>
+          <w:ilvl w:val="0"/>
+          <w:numId w:val="35"/>
+        </w:numPr>
+      </w:pPr>
       <w:r>
-        <w:t>Hola soy una bibliografía en formato APA</w:t>
+        <w:t xml:space="preserve">Memoria SSD </w:t>
+      </w:r>
+      <w:proofErr w:type="spellStart"/>
+      <w:r>
+        <w:t>Kingstone</w:t>
+      </w:r>
+      <w:proofErr w:type="spellEnd"/>
+      <w:r>
+        <w:t xml:space="preserve"> NV2</w:t>
+      </w:r>
+      <w:r>
+        <w:t xml:space="preserve"> 1 TB </w:t>
+      </w:r>
+      <w:r>
+        <w:t xml:space="preserve">M.2 </w:t>
+      </w:r>
+      <w:proofErr w:type="spellStart"/>
+      <w:r>
+        <w:t>MVMe</w:t>
+      </w:r>
+      <w:proofErr w:type="spellEnd"/>
+    </w:p>
+    <w:p>
+      <w:pPr>
+        <w:pStyle w:val="Prrafodelista"/>
+        <w:numPr>
+          <w:ilvl w:val="0"/>
+          <w:numId w:val="35"/>
+        </w:numPr>
+      </w:pPr>
+      <w:r>
+        <w:t>USB Adata 16 GB de almacenamiento</w:t>
+      </w:r>
+    </w:p>
+    <w:p>
+      <w:pPr>
+        <w:pStyle w:val="Ttulo2"/>
+      </w:pPr>
+      <w:bookmarkStart w:id="5" w:name="_Toc239866073"/>
+      <w:r>
+        <w:t>Dispositivos de computación</w:t>
+      </w:r>
+      <w:bookmarkEnd w:id="5"/>
+    </w:p>
+    <w:p>
+      <w:pPr>
+        <w:pStyle w:val="Prrafodelista"/>
+        <w:numPr>
+          <w:ilvl w:val="0"/>
+          <w:numId w:val="36"/>
+        </w:numPr>
+      </w:pPr>
+      <w:r>
+        <w:t>AMD</w:t>
+      </w:r>
+      <w:r>
+        <w:t xml:space="preserve"> Procesador</w:t>
+      </w:r>
+      <w:r>
+        <w:t xml:space="preserve"> Ryzen 5 5600</w:t>
+      </w:r>
+      <w:r>
+        <w:t xml:space="preserve"> 6 núcleos 3.5GHz 32 MB L3 Caché</w:t>
+      </w:r>
+    </w:p>
+    <w:p>
+      <w:pPr>
+        <w:pStyle w:val="Prrafodelista"/>
+        <w:numPr>
+          <w:ilvl w:val="0"/>
+          <w:numId w:val="36"/>
+        </w:numPr>
+      </w:pPr>
+      <w:r>
+        <w:t xml:space="preserve">Memoria RAM 16 GB </w:t>
+      </w:r>
+      <w:r>
+        <w:t xml:space="preserve">DDR4 </w:t>
+      </w:r>
+      <w:r>
+        <w:t xml:space="preserve">3200 </w:t>
+      </w:r>
+      <w:r>
+        <w:t>M</w:t>
+      </w:r>
+      <w:r>
+        <w:t xml:space="preserve">Hz </w:t>
+      </w:r>
+    </w:p>
+    <w:p>
+      <w:pPr>
+        <w:pStyle w:val="Prrafodelista"/>
+        <w:numPr>
+          <w:ilvl w:val="0"/>
+          <w:numId w:val="36"/>
+        </w:numPr>
+      </w:pPr>
+      <w:r>
+        <w:t xml:space="preserve">Tarjeta gráfica </w:t>
+      </w:r>
+      <w:proofErr w:type="spellStart"/>
+      <w:r>
+        <w:t>Nvidia</w:t>
+      </w:r>
+      <w:proofErr w:type="spellEnd"/>
+      <w:r>
+        <w:t xml:space="preserve"> 4060 RTX</w:t>
+      </w:r>
+      <w:r>
+        <w:t xml:space="preserve"> GeForce 8 GDDR6</w:t>
+      </w:r>
+    </w:p>
+    <w:p>
+      <w:pPr>
+        <w:pStyle w:val="Ttulo2"/>
+      </w:pPr>
+      <w:bookmarkStart w:id="6" w:name="_Toc239866074"/>
+      <w:r>
+        <w:lastRenderedPageBreak/>
+        <w:t>Dispositivos de comunicación</w:t>
+      </w:r>
+      <w:bookmarkEnd w:id="6"/>
+    </w:p>
+    <w:p>
+      <w:pPr>
+        <w:pStyle w:val="Prrafodelista"/>
+        <w:numPr>
+          <w:ilvl w:val="0"/>
+          <w:numId w:val="37"/>
+        </w:numPr>
+      </w:pPr>
+      <w:r>
+        <w:t>Modem Telmex básico con doble banda</w:t>
+      </w:r>
+    </w:p>
+    <w:p>
+      <w:pPr>
+        <w:pStyle w:val="Ttulo2"/>
+      </w:pPr>
+      <w:bookmarkStart w:id="7" w:name="_Toc239866075"/>
+      <w:r>
+        <w:t>Software</w:t>
+      </w:r>
+      <w:bookmarkEnd w:id="7"/>
+    </w:p>
+    <w:p>
+      <w:pPr>
+        <w:pStyle w:val="Ttulo3"/>
+      </w:pPr>
+      <w:bookmarkStart w:id="8" w:name="_Toc239866076"/>
+      <w:r>
+        <w:t>Software de sistema</w:t>
+      </w:r>
+      <w:bookmarkEnd w:id="8"/>
+    </w:p>
+    <w:p>
+      <w:pPr>
+        <w:pStyle w:val="Prrafodelista"/>
+        <w:numPr>
+          <w:ilvl w:val="0"/>
+          <w:numId w:val="37"/>
+        </w:numPr>
+      </w:pPr>
+      <w:r>
+        <w:t>Windows 11 Pro</w:t>
+      </w:r>
+    </w:p>
+    <w:p>
+      <w:pPr>
+        <w:pStyle w:val="Prrafodelista"/>
+        <w:numPr>
+          <w:ilvl w:val="0"/>
+          <w:numId w:val="37"/>
+        </w:numPr>
+      </w:pPr>
+      <w:r>
+        <w:t xml:space="preserve">Drivers gráficos </w:t>
+      </w:r>
+      <w:proofErr w:type="spellStart"/>
+      <w:r>
+        <w:t>Nvid</w:t>
+      </w:r>
+      <w:r>
+        <w:t>i</w:t>
+      </w:r>
+      <w:r>
+        <w:t>a</w:t>
+      </w:r>
+      <w:proofErr w:type="spellEnd"/>
+    </w:p>
+    <w:p>
+      <w:pPr>
+        <w:pStyle w:val="Prrafodelista"/>
+        <w:numPr>
+          <w:ilvl w:val="0"/>
+          <w:numId w:val="37"/>
+        </w:numPr>
+      </w:pPr>
+      <w:r>
+        <w:t xml:space="preserve">Razer </w:t>
+      </w:r>
+      <w:proofErr w:type="spellStart"/>
+      <w:r>
+        <w:t>Synapse</w:t>
+      </w:r>
+      <w:proofErr w:type="spellEnd"/>
+      <w:r>
+        <w:t xml:space="preserve"> para customización del </w:t>
+      </w:r>
+      <w:proofErr w:type="gramStart"/>
+      <w:r>
+        <w:t>mouse</w:t>
+      </w:r>
+      <w:proofErr w:type="gramEnd"/>
+      <w:r>
+        <w:t>.</w:t>
+      </w:r>
+    </w:p>
+    <w:p>
+      <w:pPr>
+        <w:pStyle w:val="Ttulo3"/>
+      </w:pPr>
+      <w:bookmarkStart w:id="9" w:name="_Toc239866077"/>
+      <w:r>
+        <w:t>Software de programación</w:t>
+      </w:r>
+      <w:bookmarkEnd w:id="9"/>
+    </w:p>
+    <w:p>
+      <w:pPr>
+        <w:pStyle w:val="Prrafodelista"/>
+        <w:numPr>
+          <w:ilvl w:val="0"/>
+          <w:numId w:val="38"/>
+        </w:numPr>
+      </w:pPr>
+      <w:r>
+        <w:t>IntelliJ</w:t>
+      </w:r>
+    </w:p>
+    <w:p>
+      <w:pPr>
+        <w:pStyle w:val="Prrafodelista"/>
+        <w:numPr>
+          <w:ilvl w:val="0"/>
+          <w:numId w:val="38"/>
+        </w:numPr>
+      </w:pPr>
+      <w:r>
+        <w:t>Visual Studio Code</w:t>
+      </w:r>
+    </w:p>
+    <w:p>
+      <w:pPr>
+        <w:pStyle w:val="Prrafodelista"/>
+        <w:numPr>
+          <w:ilvl w:val="0"/>
+          <w:numId w:val="38"/>
+        </w:numPr>
+      </w:pPr>
+      <w:r>
+        <w:t>Node.js</w:t>
+      </w:r>
+    </w:p>
+    <w:p>
+      <w:pPr>
+        <w:pStyle w:val="Prrafodelista"/>
+        <w:numPr>
+          <w:ilvl w:val="0"/>
+          <w:numId w:val="38"/>
+        </w:numPr>
+      </w:pPr>
+      <w:r>
+        <w:t>Android Studio</w:t>
+      </w:r>
+    </w:p>
+    <w:p>
+      <w:pPr>
+        <w:pStyle w:val="Prrafodelista"/>
+        <w:numPr>
+          <w:ilvl w:val="0"/>
+          <w:numId w:val="38"/>
+        </w:numPr>
+      </w:pPr>
+      <w:r>
+        <w:t>Emu8086</w:t>
+      </w:r>
+    </w:p>
+    <w:p>
+      <w:pPr>
+        <w:pStyle w:val="Prrafodelista"/>
+        <w:numPr>
+          <w:ilvl w:val="0"/>
+          <w:numId w:val="38"/>
+        </w:numPr>
+      </w:pPr>
+      <w:r>
+        <w:t>Git</w:t>
+      </w:r>
+    </w:p>
+    <w:p>
+      <w:pPr>
+        <w:pStyle w:val="Prrafodelista"/>
+        <w:numPr>
+          <w:ilvl w:val="0"/>
+          <w:numId w:val="38"/>
+        </w:numPr>
+      </w:pPr>
+      <w:r>
+        <w:t>Docker</w:t>
+      </w:r>
+    </w:p>
+    <w:p>
+      <w:pPr>
+        <w:pStyle w:val="Ttulo3"/>
+      </w:pPr>
+      <w:bookmarkStart w:id="10" w:name="_Toc239866078"/>
+      <w:r>
+        <w:t>Software de aplicación</w:t>
+      </w:r>
+      <w:bookmarkEnd w:id="10"/>
+    </w:p>
+    <w:p>
+      <w:pPr>
+        <w:pStyle w:val="Prrafodelista"/>
+        <w:numPr>
+          <w:ilvl w:val="0"/>
+          <w:numId w:val="39"/>
+        </w:numPr>
+      </w:pPr>
+      <w:r>
+        <w:t xml:space="preserve">Pack </w:t>
+      </w:r>
+      <w:r>
+        <w:t>aplicaciones</w:t>
+      </w:r>
+      <w:r>
+        <w:t xml:space="preserve"> de Office</w:t>
+      </w:r>
+    </w:p>
+    <w:p>
+      <w:pPr>
+        <w:pStyle w:val="Prrafodelista"/>
+        <w:numPr>
+          <w:ilvl w:val="0"/>
+          <w:numId w:val="39"/>
+        </w:numPr>
+      </w:pPr>
+      <w:r>
+        <w:t>Juegos variados</w:t>
+      </w:r>
+    </w:p>
+    <w:p>
+      <w:pPr>
+        <w:pStyle w:val="Prrafodelista"/>
+        <w:numPr>
+          <w:ilvl w:val="0"/>
+          <w:numId w:val="39"/>
+        </w:numPr>
+      </w:pPr>
+      <w:r>
+        <w:t>Reproductores</w:t>
+      </w:r>
+      <w:r>
+        <w:t xml:space="preserve"> de música</w:t>
+      </w:r>
+    </w:p>
+    <w:p>
+      <w:pPr>
+        <w:pStyle w:val="Prrafodelista"/>
+        <w:numPr>
+          <w:ilvl w:val="0"/>
+          <w:numId w:val="39"/>
+        </w:numPr>
+      </w:pPr>
+      <w:r>
+        <w:t>Editores de audio y video</w:t>
+      </w:r>
+    </w:p>
+    <w:p>
+      <w:pPr>
+        <w:pStyle w:val="Prrafodelista"/>
+        <w:numPr>
+          <w:ilvl w:val="0"/>
+          <w:numId w:val="39"/>
+        </w:numPr>
+      </w:pPr>
+      <w:r>
+        <w:t>Exploradores web</w:t>
       </w:r>
     </w:p>
     <w:p/>
@@ -2495,6 +3298,119 @@
     </w:lvl>
   </w:abstractNum>
   <w:abstractNum w:abstractNumId="3" w15:restartNumberingAfterBreak="0">
+    <w:nsid w:val="0448718B"/>
+    <w:multiLevelType w:val="hybridMultilevel"/>
+    <w:tmpl w:val="5FEA2196"/>
+    <w:lvl w:ilvl="0" w:tplc="080A0001">
+      <w:start w:val="1"/>
+      <w:numFmt w:val="bullet"/>
+      <w:lvlText w:val=""/>
+      <w:lvlJc w:val="left"/>
+      <w:pPr>
+        <w:ind w:left="720" w:hanging="360"/>
+      </w:pPr>
+      <w:rPr>
+        <w:rFonts w:ascii="Symbol" w:hAnsi="Symbol" w:hint="default"/>
+      </w:rPr>
+    </w:lvl>
+    <w:lvl w:ilvl="1" w:tplc="080A0003" w:tentative="1">
+      <w:start w:val="1"/>
+      <w:numFmt w:val="bullet"/>
+      <w:lvlText w:val="o"/>
+      <w:lvlJc w:val="left"/>
+      <w:pPr>
+        <w:ind w:left="1440" w:hanging="360"/>
+      </w:pPr>
+      <w:rPr>
+        <w:rFonts w:ascii="Courier New" w:hAnsi="Courier New" w:cs="Courier New" w:hint="default"/>
+      </w:rPr>
+    </w:lvl>
+    <w:lvl w:ilvl="2" w:tplc="080A0005" w:tentative="1">
+      <w:start w:val="1"/>
+      <w:numFmt w:val="bullet"/>
+      <w:lvlText w:val=""/>
+      <w:lvlJc w:val="left"/>
+      <w:pPr>
+        <w:ind w:left="2160" w:hanging="360"/>
+      </w:pPr>
+      <w:rPr>
+        <w:rFonts w:ascii="Wingdings" w:hAnsi="Wingdings" w:hint="default"/>
+      </w:rPr>
+    </w:lvl>
+    <w:lvl w:ilvl="3" w:tplc="080A0001" w:tentative="1">
+      <w:start w:val="1"/>
+      <w:numFmt w:val="bullet"/>
+      <w:lvlText w:val=""/>
+      <w:lvlJc w:val="left"/>
+      <w:pPr>
+        <w:ind w:left="2880" w:hanging="360"/>
+      </w:pPr>
+      <w:rPr>
+        <w:rFonts w:ascii="Symbol" w:hAnsi="Symbol" w:hint="default"/>
+      </w:rPr>
+    </w:lvl>
+    <w:lvl w:ilvl="4" w:tplc="080A0003" w:tentative="1">
+      <w:start w:val="1"/>
+      <w:numFmt w:val="bullet"/>
+      <w:lvlText w:val="o"/>
+      <w:lvlJc w:val="left"/>
+      <w:pPr>
+        <w:ind w:left="3600" w:hanging="360"/>
+      </w:pPr>
+      <w:rPr>
+        <w:rFonts w:ascii="Courier New" w:hAnsi="Courier New" w:cs="Courier New" w:hint="default"/>
+      </w:rPr>
+    </w:lvl>
+    <w:lvl w:ilvl="5" w:tplc="080A0005" w:tentative="1">
+      <w:start w:val="1"/>
+      <w:numFmt w:val="bullet"/>
+      <w:lvlText w:val=""/>
+      <w:lvlJc w:val="left"/>
+      <w:pPr>
+        <w:ind w:left="4320" w:hanging="360"/>
+      </w:pPr>
+      <w:rPr>
+        <w:rFonts w:ascii="Wingdings" w:hAnsi="Wingdings" w:hint="default"/>
+      </w:rPr>
+    </w:lvl>
+    <w:lvl w:ilvl="6" w:tplc="080A0001" w:tentative="1">
+      <w:start w:val="1"/>
+      <w:numFmt w:val="bullet"/>
+      <w:lvlText w:val=""/>
+      <w:lvlJc w:val="left"/>
+      <w:pPr>
+        <w:ind w:left="5040" w:hanging="360"/>
+      </w:pPr>
+      <w:rPr>
+        <w:rFonts w:ascii="Symbol" w:hAnsi="Symbol" w:hint="default"/>
+      </w:rPr>
+    </w:lvl>
+    <w:lvl w:ilvl="7" w:tplc="080A0003" w:tentative="1">
+      <w:start w:val="1"/>
+      <w:numFmt w:val="bullet"/>
+      <w:lvlText w:val="o"/>
+      <w:lvlJc w:val="left"/>
+      <w:pPr>
+        <w:ind w:left="5760" w:hanging="360"/>
+      </w:pPr>
+      <w:rPr>
+        <w:rFonts w:ascii="Courier New" w:hAnsi="Courier New" w:cs="Courier New" w:hint="default"/>
+      </w:rPr>
+    </w:lvl>
+    <w:lvl w:ilvl="8" w:tplc="080A0005" w:tentative="1">
+      <w:start w:val="1"/>
+      <w:numFmt w:val="bullet"/>
+      <w:lvlText w:val=""/>
+      <w:lvlJc w:val="left"/>
+      <w:pPr>
+        <w:ind w:left="6480" w:hanging="360"/>
+      </w:pPr>
+      <w:rPr>
+        <w:rFonts w:ascii="Wingdings" w:hAnsi="Wingdings" w:hint="default"/>
+      </w:rPr>
+    </w:lvl>
+  </w:abstractNum>
+  <w:abstractNum w:abstractNumId="4" w15:restartNumberingAfterBreak="0">
     <w:nsid w:val="0C8A4DBB"/>
     <w:multiLevelType w:val="hybridMultilevel"/>
     <w:tmpl w:val="A15A6EC4"/>
@@ -2607,7 +3523,7 @@
       </w:rPr>
     </w:lvl>
   </w:abstractNum>
-  <w:abstractNum w:abstractNumId="4" w15:restartNumberingAfterBreak="0">
+  <w:abstractNum w:abstractNumId="5" w15:restartNumberingAfterBreak="0">
     <w:nsid w:val="0F695D61"/>
     <w:multiLevelType w:val="hybridMultilevel"/>
     <w:tmpl w:val="252EDE04"/>
@@ -2693,7 +3609,120 @@
       </w:pPr>
     </w:lvl>
   </w:abstractNum>
-  <w:abstractNum w:abstractNumId="5" w15:restartNumberingAfterBreak="0">
+  <w:abstractNum w:abstractNumId="6" w15:restartNumberingAfterBreak="0">
+    <w:nsid w:val="10B644E9"/>
+    <w:multiLevelType w:val="hybridMultilevel"/>
+    <w:tmpl w:val="9DB483B8"/>
+    <w:lvl w:ilvl="0" w:tplc="080A0001">
+      <w:start w:val="1"/>
+      <w:numFmt w:val="bullet"/>
+      <w:lvlText w:val=""/>
+      <w:lvlJc w:val="left"/>
+      <w:pPr>
+        <w:ind w:left="720" w:hanging="360"/>
+      </w:pPr>
+      <w:rPr>
+        <w:rFonts w:ascii="Symbol" w:hAnsi="Symbol" w:hint="default"/>
+      </w:rPr>
+    </w:lvl>
+    <w:lvl w:ilvl="1" w:tplc="080A0003" w:tentative="1">
+      <w:start w:val="1"/>
+      <w:numFmt w:val="bullet"/>
+      <w:lvlText w:val="o"/>
+      <w:lvlJc w:val="left"/>
+      <w:pPr>
+        <w:ind w:left="1440" w:hanging="360"/>
+      </w:pPr>
+      <w:rPr>
+        <w:rFonts w:ascii="Courier New" w:hAnsi="Courier New" w:cs="Courier New" w:hint="default"/>
+      </w:rPr>
+    </w:lvl>
+    <w:lvl w:ilvl="2" w:tplc="080A0005" w:tentative="1">
+      <w:start w:val="1"/>
+      <w:numFmt w:val="bullet"/>
+      <w:lvlText w:val=""/>
+      <w:lvlJc w:val="left"/>
+      <w:pPr>
+        <w:ind w:left="2160" w:hanging="360"/>
+      </w:pPr>
+      <w:rPr>
+        <w:rFonts w:ascii="Wingdings" w:hAnsi="Wingdings" w:hint="default"/>
+      </w:rPr>
+    </w:lvl>
+    <w:lvl w:ilvl="3" w:tplc="080A0001" w:tentative="1">
+      <w:start w:val="1"/>
+      <w:numFmt w:val="bullet"/>
+      <w:lvlText w:val=""/>
+      <w:lvlJc w:val="left"/>
+      <w:pPr>
+        <w:ind w:left="2880" w:hanging="360"/>
+      </w:pPr>
+      <w:rPr>
+        <w:rFonts w:ascii="Symbol" w:hAnsi="Symbol" w:hint="default"/>
+      </w:rPr>
+    </w:lvl>
+    <w:lvl w:ilvl="4" w:tplc="080A0003" w:tentative="1">
+      <w:start w:val="1"/>
+      <w:numFmt w:val="bullet"/>
+      <w:lvlText w:val="o"/>
+      <w:lvlJc w:val="left"/>
+      <w:pPr>
+        <w:ind w:left="3600" w:hanging="360"/>
+      </w:pPr>
+      <w:rPr>
+        <w:rFonts w:ascii="Courier New" w:hAnsi="Courier New" w:cs="Courier New" w:hint="default"/>
+      </w:rPr>
+    </w:lvl>
+    <w:lvl w:ilvl="5" w:tplc="080A0005" w:tentative="1">
+      <w:start w:val="1"/>
+      <w:numFmt w:val="bullet"/>
+      <w:lvlText w:val=""/>
+      <w:lvlJc w:val="left"/>
+      <w:pPr>
+        <w:ind w:left="4320" w:hanging="360"/>
+      </w:pPr>
+      <w:rPr>
+        <w:rFonts w:ascii="Wingdings" w:hAnsi="Wingdings" w:hint="default"/>
+      </w:rPr>
+    </w:lvl>
+    <w:lvl w:ilvl="6" w:tplc="080A0001" w:tentative="1">
+      <w:start w:val="1"/>
+      <w:numFmt w:val="bullet"/>
+      <w:lvlText w:val=""/>
+      <w:lvlJc w:val="left"/>
+      <w:pPr>
+        <w:ind w:left="5040" w:hanging="360"/>
+      </w:pPr>
+      <w:rPr>
+        <w:rFonts w:ascii="Symbol" w:hAnsi="Symbol" w:hint="default"/>
+      </w:rPr>
+    </w:lvl>
+    <w:lvl w:ilvl="7" w:tplc="080A0003" w:tentative="1">
+      <w:start w:val="1"/>
+      <w:numFmt w:val="bullet"/>
+      <w:lvlText w:val="o"/>
+      <w:lvlJc w:val="left"/>
+      <w:pPr>
+        <w:ind w:left="5760" w:hanging="360"/>
+      </w:pPr>
+      <w:rPr>
+        <w:rFonts w:ascii="Courier New" w:hAnsi="Courier New" w:cs="Courier New" w:hint="default"/>
+      </w:rPr>
+    </w:lvl>
+    <w:lvl w:ilvl="8" w:tplc="080A0005" w:tentative="1">
+      <w:start w:val="1"/>
+      <w:numFmt w:val="bullet"/>
+      <w:lvlText w:val=""/>
+      <w:lvlJc w:val="left"/>
+      <w:pPr>
+        <w:ind w:left="6480" w:hanging="360"/>
+      </w:pPr>
+      <w:rPr>
+        <w:rFonts w:ascii="Wingdings" w:hAnsi="Wingdings" w:hint="default"/>
+      </w:rPr>
+    </w:lvl>
+  </w:abstractNum>
+  <w:abstractNum w:abstractNumId="7" w15:restartNumberingAfterBreak="0">
     <w:nsid w:val="11081312"/>
     <w:multiLevelType w:val="hybridMultilevel"/>
     <w:tmpl w:val="9E5816B2"/>
@@ -2779,7 +3808,7 @@
       </w:pPr>
     </w:lvl>
   </w:abstractNum>
-  <w:abstractNum w:abstractNumId="6" w15:restartNumberingAfterBreak="0">
+  <w:abstractNum w:abstractNumId="8" w15:restartNumberingAfterBreak="0">
     <w:nsid w:val="15B75010"/>
     <w:multiLevelType w:val="hybridMultilevel"/>
     <w:tmpl w:val="85520E40"/>
@@ -2892,7 +3921,7 @@
       </w:rPr>
     </w:lvl>
   </w:abstractNum>
-  <w:abstractNum w:abstractNumId="7" w15:restartNumberingAfterBreak="0">
+  <w:abstractNum w:abstractNumId="9" w15:restartNumberingAfterBreak="0">
     <w:nsid w:val="1AEC06E6"/>
     <w:multiLevelType w:val="hybridMultilevel"/>
     <w:tmpl w:val="CDD8829A"/>
@@ -3005,7 +4034,7 @@
       </w:rPr>
     </w:lvl>
   </w:abstractNum>
-  <w:abstractNum w:abstractNumId="8" w15:restartNumberingAfterBreak="0">
+  <w:abstractNum w:abstractNumId="10" w15:restartNumberingAfterBreak="0">
     <w:nsid w:val="2357072B"/>
     <w:multiLevelType w:val="hybridMultilevel"/>
     <w:tmpl w:val="383E2788"/>
@@ -3118,7 +4147,120 @@
       </w:rPr>
     </w:lvl>
   </w:abstractNum>
-  <w:abstractNum w:abstractNumId="9" w15:restartNumberingAfterBreak="0">
+  <w:abstractNum w:abstractNumId="11" w15:restartNumberingAfterBreak="0">
+    <w:nsid w:val="24F91B79"/>
+    <w:multiLevelType w:val="hybridMultilevel"/>
+    <w:tmpl w:val="70E43E0A"/>
+    <w:lvl w:ilvl="0" w:tplc="080A0001">
+      <w:start w:val="1"/>
+      <w:numFmt w:val="bullet"/>
+      <w:lvlText w:val=""/>
+      <w:lvlJc w:val="left"/>
+      <w:pPr>
+        <w:ind w:left="720" w:hanging="360"/>
+      </w:pPr>
+      <w:rPr>
+        <w:rFonts w:ascii="Symbol" w:hAnsi="Symbol" w:hint="default"/>
+      </w:rPr>
+    </w:lvl>
+    <w:lvl w:ilvl="1" w:tplc="080A0003" w:tentative="1">
+      <w:start w:val="1"/>
+      <w:numFmt w:val="bullet"/>
+      <w:lvlText w:val="o"/>
+      <w:lvlJc w:val="left"/>
+      <w:pPr>
+        <w:ind w:left="1440" w:hanging="360"/>
+      </w:pPr>
+      <w:rPr>
+        <w:rFonts w:ascii="Courier New" w:hAnsi="Courier New" w:cs="Courier New" w:hint="default"/>
+      </w:rPr>
+    </w:lvl>
+    <w:lvl w:ilvl="2" w:tplc="080A0005" w:tentative="1">
+      <w:start w:val="1"/>
+      <w:numFmt w:val="bullet"/>
+      <w:lvlText w:val=""/>
+      <w:lvlJc w:val="left"/>
+      <w:pPr>
+        <w:ind w:left="2160" w:hanging="360"/>
+      </w:pPr>
+      <w:rPr>
+        <w:rFonts w:ascii="Wingdings" w:hAnsi="Wingdings" w:hint="default"/>
+      </w:rPr>
+    </w:lvl>
+    <w:lvl w:ilvl="3" w:tplc="080A0001" w:tentative="1">
+      <w:start w:val="1"/>
+      <w:numFmt w:val="bullet"/>
+      <w:lvlText w:val=""/>
+      <w:lvlJc w:val="left"/>
+      <w:pPr>
+        <w:ind w:left="2880" w:hanging="360"/>
+      </w:pPr>
+      <w:rPr>
+        <w:rFonts w:ascii="Symbol" w:hAnsi="Symbol" w:hint="default"/>
+      </w:rPr>
+    </w:lvl>
+    <w:lvl w:ilvl="4" w:tplc="080A0003" w:tentative="1">
+      <w:start w:val="1"/>
+      <w:numFmt w:val="bullet"/>
+      <w:lvlText w:val="o"/>
+      <w:lvlJc w:val="left"/>
+      <w:pPr>
+        <w:ind w:left="3600" w:hanging="360"/>
+      </w:pPr>
+      <w:rPr>
+        <w:rFonts w:ascii="Courier New" w:hAnsi="Courier New" w:cs="Courier New" w:hint="default"/>
+      </w:rPr>
+    </w:lvl>
+    <w:lvl w:ilvl="5" w:tplc="080A0005" w:tentative="1">
+      <w:start w:val="1"/>
+      <w:numFmt w:val="bullet"/>
+      <w:lvlText w:val=""/>
+      <w:lvlJc w:val="left"/>
+      <w:pPr>
+        <w:ind w:left="4320" w:hanging="360"/>
+      </w:pPr>
+      <w:rPr>
+        <w:rFonts w:ascii="Wingdings" w:hAnsi="Wingdings" w:hint="default"/>
+      </w:rPr>
+    </w:lvl>
+    <w:lvl w:ilvl="6" w:tplc="080A0001" w:tentative="1">
+      <w:start w:val="1"/>
+      <w:numFmt w:val="bullet"/>
+      <w:lvlText w:val=""/>
+      <w:lvlJc w:val="left"/>
+      <w:pPr>
+        <w:ind w:left="5040" w:hanging="360"/>
+      </w:pPr>
+      <w:rPr>
+        <w:rFonts w:ascii="Symbol" w:hAnsi="Symbol" w:hint="default"/>
+      </w:rPr>
+    </w:lvl>
+    <w:lvl w:ilvl="7" w:tplc="080A0003" w:tentative="1">
+      <w:start w:val="1"/>
+      <w:numFmt w:val="bullet"/>
+      <w:lvlText w:val="o"/>
+      <w:lvlJc w:val="left"/>
+      <w:pPr>
+        <w:ind w:left="5760" w:hanging="360"/>
+      </w:pPr>
+      <w:rPr>
+        <w:rFonts w:ascii="Courier New" w:hAnsi="Courier New" w:cs="Courier New" w:hint="default"/>
+      </w:rPr>
+    </w:lvl>
+    <w:lvl w:ilvl="8" w:tplc="080A0005" w:tentative="1">
+      <w:start w:val="1"/>
+      <w:numFmt w:val="bullet"/>
+      <w:lvlText w:val=""/>
+      <w:lvlJc w:val="left"/>
+      <w:pPr>
+        <w:ind w:left="6480" w:hanging="360"/>
+      </w:pPr>
+      <w:rPr>
+        <w:rFonts w:ascii="Wingdings" w:hAnsi="Wingdings" w:hint="default"/>
+      </w:rPr>
+    </w:lvl>
+  </w:abstractNum>
+  <w:abstractNum w:abstractNumId="12" w15:restartNumberingAfterBreak="0">
     <w:nsid w:val="252C402B"/>
     <w:multiLevelType w:val="hybridMultilevel"/>
     <w:tmpl w:val="E3828E10"/>
@@ -3231,7 +4373,7 @@
       </w:rPr>
     </w:lvl>
   </w:abstractNum>
-  <w:abstractNum w:abstractNumId="10" w15:restartNumberingAfterBreak="0">
+  <w:abstractNum w:abstractNumId="13" w15:restartNumberingAfterBreak="0">
     <w:nsid w:val="26704FAC"/>
     <w:multiLevelType w:val="hybridMultilevel"/>
     <w:tmpl w:val="78A259AE"/>
@@ -3344,7 +4486,7 @@
       </w:rPr>
     </w:lvl>
   </w:abstractNum>
-  <w:abstractNum w:abstractNumId="11" w15:restartNumberingAfterBreak="0">
+  <w:abstractNum w:abstractNumId="14" w15:restartNumberingAfterBreak="0">
     <w:nsid w:val="27A2319E"/>
     <w:multiLevelType w:val="hybridMultilevel"/>
     <w:tmpl w:val="E974ABBC"/>
@@ -3457,7 +4599,7 @@
       </w:rPr>
     </w:lvl>
   </w:abstractNum>
-  <w:abstractNum w:abstractNumId="12" w15:restartNumberingAfterBreak="0">
+  <w:abstractNum w:abstractNumId="15" w15:restartNumberingAfterBreak="0">
     <w:nsid w:val="2A4E31E0"/>
     <w:multiLevelType w:val="hybridMultilevel"/>
     <w:tmpl w:val="595C7D88"/>
@@ -3570,7 +4712,7 @@
       </w:rPr>
     </w:lvl>
   </w:abstractNum>
-  <w:abstractNum w:abstractNumId="13" w15:restartNumberingAfterBreak="0">
+  <w:abstractNum w:abstractNumId="16" w15:restartNumberingAfterBreak="0">
     <w:nsid w:val="2C0B5195"/>
     <w:multiLevelType w:val="hybridMultilevel"/>
     <w:tmpl w:val="FE9C5F14"/>
@@ -3683,7 +4825,120 @@
       </w:rPr>
     </w:lvl>
   </w:abstractNum>
-  <w:abstractNum w:abstractNumId="14" w15:restartNumberingAfterBreak="0">
+  <w:abstractNum w:abstractNumId="17" w15:restartNumberingAfterBreak="0">
+    <w:nsid w:val="2EA76D99"/>
+    <w:multiLevelType w:val="hybridMultilevel"/>
+    <w:tmpl w:val="8732F1E4"/>
+    <w:lvl w:ilvl="0" w:tplc="080A0001">
+      <w:start w:val="1"/>
+      <w:numFmt w:val="bullet"/>
+      <w:lvlText w:val=""/>
+      <w:lvlJc w:val="left"/>
+      <w:pPr>
+        <w:ind w:left="720" w:hanging="360"/>
+      </w:pPr>
+      <w:rPr>
+        <w:rFonts w:ascii="Symbol" w:hAnsi="Symbol" w:hint="default"/>
+      </w:rPr>
+    </w:lvl>
+    <w:lvl w:ilvl="1" w:tplc="080A0003" w:tentative="1">
+      <w:start w:val="1"/>
+      <w:numFmt w:val="bullet"/>
+      <w:lvlText w:val="o"/>
+      <w:lvlJc w:val="left"/>
+      <w:pPr>
+        <w:ind w:left="1440" w:hanging="360"/>
+      </w:pPr>
+      <w:rPr>
+        <w:rFonts w:ascii="Courier New" w:hAnsi="Courier New" w:cs="Courier New" w:hint="default"/>
+      </w:rPr>
+    </w:lvl>
+    <w:lvl w:ilvl="2" w:tplc="080A0005" w:tentative="1">
+      <w:start w:val="1"/>
+      <w:numFmt w:val="bullet"/>
+      <w:lvlText w:val=""/>
+      <w:lvlJc w:val="left"/>
+      <w:pPr>
+        <w:ind w:left="2160" w:hanging="360"/>
+      </w:pPr>
+      <w:rPr>
+        <w:rFonts w:ascii="Wingdings" w:hAnsi="Wingdings" w:hint="default"/>
+      </w:rPr>
+    </w:lvl>
+    <w:lvl w:ilvl="3" w:tplc="080A0001" w:tentative="1">
+      <w:start w:val="1"/>
+      <w:numFmt w:val="bullet"/>
+      <w:lvlText w:val=""/>
+      <w:lvlJc w:val="left"/>
+      <w:pPr>
+        <w:ind w:left="2880" w:hanging="360"/>
+      </w:pPr>
+      <w:rPr>
+        <w:rFonts w:ascii="Symbol" w:hAnsi="Symbol" w:hint="default"/>
+      </w:rPr>
+    </w:lvl>
+    <w:lvl w:ilvl="4" w:tplc="080A0003" w:tentative="1">
+      <w:start w:val="1"/>
+      <w:numFmt w:val="bullet"/>
+      <w:lvlText w:val="o"/>
+      <w:lvlJc w:val="left"/>
+      <w:pPr>
+        <w:ind w:left="3600" w:hanging="360"/>
+      </w:pPr>
+      <w:rPr>
+        <w:rFonts w:ascii="Courier New" w:hAnsi="Courier New" w:cs="Courier New" w:hint="default"/>
+      </w:rPr>
+    </w:lvl>
+    <w:lvl w:ilvl="5" w:tplc="080A0005" w:tentative="1">
+      <w:start w:val="1"/>
+      <w:numFmt w:val="bullet"/>
+      <w:lvlText w:val=""/>
+      <w:lvlJc w:val="left"/>
+      <w:pPr>
+        <w:ind w:left="4320" w:hanging="360"/>
+      </w:pPr>
+      <w:rPr>
+        <w:rFonts w:ascii="Wingdings" w:hAnsi="Wingdings" w:hint="default"/>
+      </w:rPr>
+    </w:lvl>
+    <w:lvl w:ilvl="6" w:tplc="080A0001" w:tentative="1">
+      <w:start w:val="1"/>
+      <w:numFmt w:val="bullet"/>
+      <w:lvlText w:val=""/>
+      <w:lvlJc w:val="left"/>
+      <w:pPr>
+        <w:ind w:left="5040" w:hanging="360"/>
+      </w:pPr>
+      <w:rPr>
+        <w:rFonts w:ascii="Symbol" w:hAnsi="Symbol" w:hint="default"/>
+      </w:rPr>
+    </w:lvl>
+    <w:lvl w:ilvl="7" w:tplc="080A0003" w:tentative="1">
+      <w:start w:val="1"/>
+      <w:numFmt w:val="bullet"/>
+      <w:lvlText w:val="o"/>
+      <w:lvlJc w:val="left"/>
+      <w:pPr>
+        <w:ind w:left="5760" w:hanging="360"/>
+      </w:pPr>
+      <w:rPr>
+        <w:rFonts w:ascii="Courier New" w:hAnsi="Courier New" w:cs="Courier New" w:hint="default"/>
+      </w:rPr>
+    </w:lvl>
+    <w:lvl w:ilvl="8" w:tplc="080A0005" w:tentative="1">
+      <w:start w:val="1"/>
+      <w:numFmt w:val="bullet"/>
+      <w:lvlText w:val=""/>
+      <w:lvlJc w:val="left"/>
+      <w:pPr>
+        <w:ind w:left="6480" w:hanging="360"/>
+      </w:pPr>
+      <w:rPr>
+        <w:rFonts w:ascii="Wingdings" w:hAnsi="Wingdings" w:hint="default"/>
+      </w:rPr>
+    </w:lvl>
+  </w:abstractNum>
+  <w:abstractNum w:abstractNumId="18" w15:restartNumberingAfterBreak="0">
     <w:nsid w:val="32E8256A"/>
     <w:multiLevelType w:val="hybridMultilevel"/>
     <w:tmpl w:val="35B27F0C"/>
@@ -3796,7 +5051,120 @@
       </w:rPr>
     </w:lvl>
   </w:abstractNum>
-  <w:abstractNum w:abstractNumId="15" w15:restartNumberingAfterBreak="0">
+  <w:abstractNum w:abstractNumId="19" w15:restartNumberingAfterBreak="0">
+    <w:nsid w:val="3C9C65E2"/>
+    <w:multiLevelType w:val="hybridMultilevel"/>
+    <w:tmpl w:val="B8F416B6"/>
+    <w:lvl w:ilvl="0" w:tplc="080A0001">
+      <w:start w:val="1"/>
+      <w:numFmt w:val="bullet"/>
+      <w:lvlText w:val=""/>
+      <w:lvlJc w:val="left"/>
+      <w:pPr>
+        <w:ind w:left="720" w:hanging="360"/>
+      </w:pPr>
+      <w:rPr>
+        <w:rFonts w:ascii="Symbol" w:hAnsi="Symbol" w:hint="default"/>
+      </w:rPr>
+    </w:lvl>
+    <w:lvl w:ilvl="1" w:tplc="080A0003" w:tentative="1">
+      <w:start w:val="1"/>
+      <w:numFmt w:val="bullet"/>
+      <w:lvlText w:val="o"/>
+      <w:lvlJc w:val="left"/>
+      <w:pPr>
+        <w:ind w:left="1440" w:hanging="360"/>
+      </w:pPr>
+      <w:rPr>
+        <w:rFonts w:ascii="Courier New" w:hAnsi="Courier New" w:cs="Courier New" w:hint="default"/>
+      </w:rPr>
+    </w:lvl>
+    <w:lvl w:ilvl="2" w:tplc="080A0005" w:tentative="1">
+      <w:start w:val="1"/>
+      <w:numFmt w:val="bullet"/>
+      <w:lvlText w:val=""/>
+      <w:lvlJc w:val="left"/>
+      <w:pPr>
+        <w:ind w:left="2160" w:hanging="360"/>
+      </w:pPr>
+      <w:rPr>
+        <w:rFonts w:ascii="Wingdings" w:hAnsi="Wingdings" w:hint="default"/>
+      </w:rPr>
+    </w:lvl>
+    <w:lvl w:ilvl="3" w:tplc="080A0001" w:tentative="1">
+      <w:start w:val="1"/>
+      <w:numFmt w:val="bullet"/>
+      <w:lvlText w:val=""/>
+      <w:lvlJc w:val="left"/>
+      <w:pPr>
+        <w:ind w:left="2880" w:hanging="360"/>
+      </w:pPr>
+      <w:rPr>
+        <w:rFonts w:ascii="Symbol" w:hAnsi="Symbol" w:hint="default"/>
+      </w:rPr>
+    </w:lvl>
+    <w:lvl w:ilvl="4" w:tplc="080A0003" w:tentative="1">
+      <w:start w:val="1"/>
+      <w:numFmt w:val="bullet"/>
+      <w:lvlText w:val="o"/>
+      <w:lvlJc w:val="left"/>
+      <w:pPr>
+        <w:ind w:left="3600" w:hanging="360"/>
+      </w:pPr>
+      <w:rPr>
+        <w:rFonts w:ascii="Courier New" w:hAnsi="Courier New" w:cs="Courier New" w:hint="default"/>
+      </w:rPr>
+    </w:lvl>
+    <w:lvl w:ilvl="5" w:tplc="080A0005" w:tentative="1">
+      <w:start w:val="1"/>
+      <w:numFmt w:val="bullet"/>
+      <w:lvlText w:val=""/>
+      <w:lvlJc w:val="left"/>
+      <w:pPr>
+        <w:ind w:left="4320" w:hanging="360"/>
+      </w:pPr>
+      <w:rPr>
+        <w:rFonts w:ascii="Wingdings" w:hAnsi="Wingdings" w:hint="default"/>
+      </w:rPr>
+    </w:lvl>
+    <w:lvl w:ilvl="6" w:tplc="080A0001" w:tentative="1">
+      <w:start w:val="1"/>
+      <w:numFmt w:val="bullet"/>
+      <w:lvlText w:val=""/>
+      <w:lvlJc w:val="left"/>
+      <w:pPr>
+        <w:ind w:left="5040" w:hanging="360"/>
+      </w:pPr>
+      <w:rPr>
+        <w:rFonts w:ascii="Symbol" w:hAnsi="Symbol" w:hint="default"/>
+      </w:rPr>
+    </w:lvl>
+    <w:lvl w:ilvl="7" w:tplc="080A0003" w:tentative="1">
+      <w:start w:val="1"/>
+      <w:numFmt w:val="bullet"/>
+      <w:lvlText w:val="o"/>
+      <w:lvlJc w:val="left"/>
+      <w:pPr>
+        <w:ind w:left="5760" w:hanging="360"/>
+      </w:pPr>
+      <w:rPr>
+        <w:rFonts w:ascii="Courier New" w:hAnsi="Courier New" w:cs="Courier New" w:hint="default"/>
+      </w:rPr>
+    </w:lvl>
+    <w:lvl w:ilvl="8" w:tplc="080A0005" w:tentative="1">
+      <w:start w:val="1"/>
+      <w:numFmt w:val="bullet"/>
+      <w:lvlText w:val=""/>
+      <w:lvlJc w:val="left"/>
+      <w:pPr>
+        <w:ind w:left="6480" w:hanging="360"/>
+      </w:pPr>
+      <w:rPr>
+        <w:rFonts w:ascii="Wingdings" w:hAnsi="Wingdings" w:hint="default"/>
+      </w:rPr>
+    </w:lvl>
+  </w:abstractNum>
+  <w:abstractNum w:abstractNumId="20" w15:restartNumberingAfterBreak="0">
     <w:nsid w:val="3D2C0E66"/>
     <w:multiLevelType w:val="hybridMultilevel"/>
     <w:tmpl w:val="324A86FE"/>
@@ -3909,7 +5277,7 @@
       </w:rPr>
     </w:lvl>
   </w:abstractNum>
-  <w:abstractNum w:abstractNumId="16" w15:restartNumberingAfterBreak="0">
+  <w:abstractNum w:abstractNumId="21" w15:restartNumberingAfterBreak="0">
     <w:nsid w:val="3D4950BC"/>
     <w:multiLevelType w:val="hybridMultilevel"/>
     <w:tmpl w:val="32C636D8"/>
@@ -4022,7 +5390,7 @@
       </w:rPr>
     </w:lvl>
   </w:abstractNum>
-  <w:abstractNum w:abstractNumId="17" w15:restartNumberingAfterBreak="0">
+  <w:abstractNum w:abstractNumId="22" w15:restartNumberingAfterBreak="0">
     <w:nsid w:val="3EE357D5"/>
     <w:multiLevelType w:val="hybridMultilevel"/>
     <w:tmpl w:val="B06250B4"/>
@@ -4135,7 +5503,120 @@
       </w:rPr>
     </w:lvl>
   </w:abstractNum>
-  <w:abstractNum w:abstractNumId="18" w15:restartNumberingAfterBreak="0">
+  <w:abstractNum w:abstractNumId="23" w15:restartNumberingAfterBreak="0">
+    <w:nsid w:val="415E6206"/>
+    <w:multiLevelType w:val="hybridMultilevel"/>
+    <w:tmpl w:val="8E3C1D4C"/>
+    <w:lvl w:ilvl="0" w:tplc="080A0001">
+      <w:start w:val="1"/>
+      <w:numFmt w:val="bullet"/>
+      <w:lvlText w:val=""/>
+      <w:lvlJc w:val="left"/>
+      <w:pPr>
+        <w:ind w:left="720" w:hanging="360"/>
+      </w:pPr>
+      <w:rPr>
+        <w:rFonts w:ascii="Symbol" w:hAnsi="Symbol" w:hint="default"/>
+      </w:rPr>
+    </w:lvl>
+    <w:lvl w:ilvl="1" w:tplc="080A0003" w:tentative="1">
+      <w:start w:val="1"/>
+      <w:numFmt w:val="bullet"/>
+      <w:lvlText w:val="o"/>
+      <w:lvlJc w:val="left"/>
+      <w:pPr>
+        <w:ind w:left="1440" w:hanging="360"/>
+      </w:pPr>
+      <w:rPr>
+        <w:rFonts w:ascii="Courier New" w:hAnsi="Courier New" w:cs="Courier New" w:hint="default"/>
+      </w:rPr>
+    </w:lvl>
+    <w:lvl w:ilvl="2" w:tplc="080A0005" w:tentative="1">
+      <w:start w:val="1"/>
+      <w:numFmt w:val="bullet"/>
+      <w:lvlText w:val=""/>
+      <w:lvlJc w:val="left"/>
+      <w:pPr>
+        <w:ind w:left="2160" w:hanging="360"/>
+      </w:pPr>
+      <w:rPr>
+        <w:rFonts w:ascii="Wingdings" w:hAnsi="Wingdings" w:hint="default"/>
+      </w:rPr>
+    </w:lvl>
+    <w:lvl w:ilvl="3" w:tplc="080A0001" w:tentative="1">
+      <w:start w:val="1"/>
+      <w:numFmt w:val="bullet"/>
+      <w:lvlText w:val=""/>
+      <w:lvlJc w:val="left"/>
+      <w:pPr>
+        <w:ind w:left="2880" w:hanging="360"/>
+      </w:pPr>
+      <w:rPr>
+        <w:rFonts w:ascii="Symbol" w:hAnsi="Symbol" w:hint="default"/>
+      </w:rPr>
+    </w:lvl>
+    <w:lvl w:ilvl="4" w:tplc="080A0003" w:tentative="1">
+      <w:start w:val="1"/>
+      <w:numFmt w:val="bullet"/>
+      <w:lvlText w:val="o"/>
+      <w:lvlJc w:val="left"/>
+      <w:pPr>
+        <w:ind w:left="3600" w:hanging="360"/>
+      </w:pPr>
+      <w:rPr>
+        <w:rFonts w:ascii="Courier New" w:hAnsi="Courier New" w:cs="Courier New" w:hint="default"/>
+      </w:rPr>
+    </w:lvl>
+    <w:lvl w:ilvl="5" w:tplc="080A0005" w:tentative="1">
+      <w:start w:val="1"/>
+      <w:numFmt w:val="bullet"/>
+      <w:lvlText w:val=""/>
+      <w:lvlJc w:val="left"/>
+      <w:pPr>
+        <w:ind w:left="4320" w:hanging="360"/>
+      </w:pPr>
+      <w:rPr>
+        <w:rFonts w:ascii="Wingdings" w:hAnsi="Wingdings" w:hint="default"/>
+      </w:rPr>
+    </w:lvl>
+    <w:lvl w:ilvl="6" w:tplc="080A0001" w:tentative="1">
+      <w:start w:val="1"/>
+      <w:numFmt w:val="bullet"/>
+      <w:lvlText w:val=""/>
+      <w:lvlJc w:val="left"/>
+      <w:pPr>
+        <w:ind w:left="5040" w:hanging="360"/>
+      </w:pPr>
+      <w:rPr>
+        <w:rFonts w:ascii="Symbol" w:hAnsi="Symbol" w:hint="default"/>
+      </w:rPr>
+    </w:lvl>
+    <w:lvl w:ilvl="7" w:tplc="080A0003" w:tentative="1">
+      <w:start w:val="1"/>
+      <w:numFmt w:val="bullet"/>
+      <w:lvlText w:val="o"/>
+      <w:lvlJc w:val="left"/>
+      <w:pPr>
+        <w:ind w:left="5760" w:hanging="360"/>
+      </w:pPr>
+      <w:rPr>
+        <w:rFonts w:ascii="Courier New" w:hAnsi="Courier New" w:cs="Courier New" w:hint="default"/>
+      </w:rPr>
+    </w:lvl>
+    <w:lvl w:ilvl="8" w:tplc="080A0005" w:tentative="1">
+      <w:start w:val="1"/>
+      <w:numFmt w:val="bullet"/>
+      <w:lvlText w:val=""/>
+      <w:lvlJc w:val="left"/>
+      <w:pPr>
+        <w:ind w:left="6480" w:hanging="360"/>
+      </w:pPr>
+      <w:rPr>
+        <w:rFonts w:ascii="Wingdings" w:hAnsi="Wingdings" w:hint="default"/>
+      </w:rPr>
+    </w:lvl>
+  </w:abstractNum>
+  <w:abstractNum w:abstractNumId="24" w15:restartNumberingAfterBreak="0">
     <w:nsid w:val="432058A2"/>
     <w:multiLevelType w:val="hybridMultilevel"/>
     <w:tmpl w:val="EC5621DC"/>
@@ -4248,7 +5729,7 @@
       </w:rPr>
     </w:lvl>
   </w:abstractNum>
-  <w:abstractNum w:abstractNumId="19" w15:restartNumberingAfterBreak="0">
+  <w:abstractNum w:abstractNumId="25" w15:restartNumberingAfterBreak="0">
     <w:nsid w:val="45C55BFE"/>
     <w:multiLevelType w:val="hybridMultilevel"/>
     <w:tmpl w:val="D92E599C"/>
@@ -4361,7 +5842,7 @@
       </w:rPr>
     </w:lvl>
   </w:abstractNum>
-  <w:abstractNum w:abstractNumId="20" w15:restartNumberingAfterBreak="0">
+  <w:abstractNum w:abstractNumId="26" w15:restartNumberingAfterBreak="0">
     <w:nsid w:val="4789116B"/>
     <w:multiLevelType w:val="hybridMultilevel"/>
     <w:tmpl w:val="F5D0E744"/>
@@ -4474,7 +5955,7 @@
       </w:rPr>
     </w:lvl>
   </w:abstractNum>
-  <w:abstractNum w:abstractNumId="21" w15:restartNumberingAfterBreak="0">
+  <w:abstractNum w:abstractNumId="27" w15:restartNumberingAfterBreak="0">
     <w:nsid w:val="4FA653D3"/>
     <w:multiLevelType w:val="hybridMultilevel"/>
     <w:tmpl w:val="2F145B30"/>
@@ -4563,7 +6044,7 @@
       </w:pPr>
     </w:lvl>
   </w:abstractNum>
-  <w:abstractNum w:abstractNumId="22" w15:restartNumberingAfterBreak="0">
+  <w:abstractNum w:abstractNumId="28" w15:restartNumberingAfterBreak="0">
     <w:nsid w:val="5C614E09"/>
     <w:multiLevelType w:val="hybridMultilevel"/>
     <w:tmpl w:val="C6F0588A"/>
@@ -4649,7 +6130,7 @@
       </w:pPr>
     </w:lvl>
   </w:abstractNum>
-  <w:abstractNum w:abstractNumId="23" w15:restartNumberingAfterBreak="0">
+  <w:abstractNum w:abstractNumId="29" w15:restartNumberingAfterBreak="0">
     <w:nsid w:val="5D0303E9"/>
     <w:multiLevelType w:val="hybridMultilevel"/>
     <w:tmpl w:val="7BF8642E"/>
@@ -4735,7 +6216,7 @@
       </w:pPr>
     </w:lvl>
   </w:abstractNum>
-  <w:abstractNum w:abstractNumId="24" w15:restartNumberingAfterBreak="0">
+  <w:abstractNum w:abstractNumId="30" w15:restartNumberingAfterBreak="0">
     <w:nsid w:val="5D3E675A"/>
     <w:multiLevelType w:val="hybridMultilevel"/>
     <w:tmpl w:val="531CDDE4"/>
@@ -4848,7 +6329,7 @@
       </w:rPr>
     </w:lvl>
   </w:abstractNum>
-  <w:abstractNum w:abstractNumId="25" w15:restartNumberingAfterBreak="0">
+  <w:abstractNum w:abstractNumId="31" w15:restartNumberingAfterBreak="0">
     <w:nsid w:val="5E2162D0"/>
     <w:multiLevelType w:val="hybridMultilevel"/>
     <w:tmpl w:val="19F640F0"/>
@@ -4961,7 +6442,7 @@
       </w:rPr>
     </w:lvl>
   </w:abstractNum>
-  <w:abstractNum w:abstractNumId="26" w15:restartNumberingAfterBreak="0">
+  <w:abstractNum w:abstractNumId="32" w15:restartNumberingAfterBreak="0">
     <w:nsid w:val="63520ADD"/>
     <w:multiLevelType w:val="hybridMultilevel"/>
     <w:tmpl w:val="D97630C4"/>
@@ -5074,7 +6555,7 @@
       </w:rPr>
     </w:lvl>
   </w:abstractNum>
-  <w:abstractNum w:abstractNumId="27" w15:restartNumberingAfterBreak="0">
+  <w:abstractNum w:abstractNumId="33" w15:restartNumberingAfterBreak="0">
     <w:nsid w:val="67A32EBF"/>
     <w:multiLevelType w:val="hybridMultilevel"/>
     <w:tmpl w:val="127C7076"/>
@@ -5187,7 +6668,7 @@
       </w:rPr>
     </w:lvl>
   </w:abstractNum>
-  <w:abstractNum w:abstractNumId="28" w15:restartNumberingAfterBreak="0">
+  <w:abstractNum w:abstractNumId="34" w15:restartNumberingAfterBreak="0">
     <w:nsid w:val="6E6F759E"/>
     <w:multiLevelType w:val="hybridMultilevel"/>
     <w:tmpl w:val="1CA448FC"/>
@@ -5300,7 +6781,120 @@
       </w:rPr>
     </w:lvl>
   </w:abstractNum>
-  <w:abstractNum w:abstractNumId="29" w15:restartNumberingAfterBreak="0">
+  <w:abstractNum w:abstractNumId="35" w15:restartNumberingAfterBreak="0">
+    <w:nsid w:val="6EB859FE"/>
+    <w:multiLevelType w:val="hybridMultilevel"/>
+    <w:tmpl w:val="5470D2E8"/>
+    <w:lvl w:ilvl="0" w:tplc="080A0001">
+      <w:start w:val="1"/>
+      <w:numFmt w:val="bullet"/>
+      <w:lvlText w:val=""/>
+      <w:lvlJc w:val="left"/>
+      <w:pPr>
+        <w:ind w:left="720" w:hanging="360"/>
+      </w:pPr>
+      <w:rPr>
+        <w:rFonts w:ascii="Symbol" w:hAnsi="Symbol" w:hint="default"/>
+      </w:rPr>
+    </w:lvl>
+    <w:lvl w:ilvl="1" w:tplc="080A0003" w:tentative="1">
+      <w:start w:val="1"/>
+      <w:numFmt w:val="bullet"/>
+      <w:lvlText w:val="o"/>
+      <w:lvlJc w:val="left"/>
+      <w:pPr>
+        <w:ind w:left="1440" w:hanging="360"/>
+      </w:pPr>
+      <w:rPr>
+        <w:rFonts w:ascii="Courier New" w:hAnsi="Courier New" w:cs="Courier New" w:hint="default"/>
+      </w:rPr>
+    </w:lvl>
+    <w:lvl w:ilvl="2" w:tplc="080A0005" w:tentative="1">
+      <w:start w:val="1"/>
+      <w:numFmt w:val="bullet"/>
+      <w:lvlText w:val=""/>
+      <w:lvlJc w:val="left"/>
+      <w:pPr>
+        <w:ind w:left="2160" w:hanging="360"/>
+      </w:pPr>
+      <w:rPr>
+        <w:rFonts w:ascii="Wingdings" w:hAnsi="Wingdings" w:hint="default"/>
+      </w:rPr>
+    </w:lvl>
+    <w:lvl w:ilvl="3" w:tplc="080A0001" w:tentative="1">
+      <w:start w:val="1"/>
+      <w:numFmt w:val="bullet"/>
+      <w:lvlText w:val=""/>
+      <w:lvlJc w:val="left"/>
+      <w:pPr>
+        <w:ind w:left="2880" w:hanging="360"/>
+      </w:pPr>
+      <w:rPr>
+        <w:rFonts w:ascii="Symbol" w:hAnsi="Symbol" w:hint="default"/>
+      </w:rPr>
+    </w:lvl>
+    <w:lvl w:ilvl="4" w:tplc="080A0003" w:tentative="1">
+      <w:start w:val="1"/>
+      <w:numFmt w:val="bullet"/>
+      <w:lvlText w:val="o"/>
+      <w:lvlJc w:val="left"/>
+      <w:pPr>
+        <w:ind w:left="3600" w:hanging="360"/>
+      </w:pPr>
+      <w:rPr>
+        <w:rFonts w:ascii="Courier New" w:hAnsi="Courier New" w:cs="Courier New" w:hint="default"/>
+      </w:rPr>
+    </w:lvl>
+    <w:lvl w:ilvl="5" w:tplc="080A0005" w:tentative="1">
+      <w:start w:val="1"/>
+      <w:numFmt w:val="bullet"/>
+      <w:lvlText w:val=""/>
+      <w:lvlJc w:val="left"/>
+      <w:pPr>
+        <w:ind w:left="4320" w:hanging="360"/>
+      </w:pPr>
+      <w:rPr>
+        <w:rFonts w:ascii="Wingdings" w:hAnsi="Wingdings" w:hint="default"/>
+      </w:rPr>
+    </w:lvl>
+    <w:lvl w:ilvl="6" w:tplc="080A0001" w:tentative="1">
+      <w:start w:val="1"/>
+      <w:numFmt w:val="bullet"/>
+      <w:lvlText w:val=""/>
+      <w:lvlJc w:val="left"/>
+      <w:pPr>
+        <w:ind w:left="5040" w:hanging="360"/>
+      </w:pPr>
+      <w:rPr>
+        <w:rFonts w:ascii="Symbol" w:hAnsi="Symbol" w:hint="default"/>
+      </w:rPr>
+    </w:lvl>
+    <w:lvl w:ilvl="7" w:tplc="080A0003" w:tentative="1">
+      <w:start w:val="1"/>
+      <w:numFmt w:val="bullet"/>
+      <w:lvlText w:val="o"/>
+      <w:lvlJc w:val="left"/>
+      <w:pPr>
+        <w:ind w:left="5760" w:hanging="360"/>
+      </w:pPr>
+      <w:rPr>
+        <w:rFonts w:ascii="Courier New" w:hAnsi="Courier New" w:cs="Courier New" w:hint="default"/>
+      </w:rPr>
+    </w:lvl>
+    <w:lvl w:ilvl="8" w:tplc="080A0005" w:tentative="1">
+      <w:start w:val="1"/>
+      <w:numFmt w:val="bullet"/>
+      <w:lvlText w:val=""/>
+      <w:lvlJc w:val="left"/>
+      <w:pPr>
+        <w:ind w:left="6480" w:hanging="360"/>
+      </w:pPr>
+      <w:rPr>
+        <w:rFonts w:ascii="Wingdings" w:hAnsi="Wingdings" w:hint="default"/>
+      </w:rPr>
+    </w:lvl>
+  </w:abstractNum>
+  <w:abstractNum w:abstractNumId="36" w15:restartNumberingAfterBreak="0">
     <w:nsid w:val="784530C1"/>
     <w:multiLevelType w:val="hybridMultilevel"/>
     <w:tmpl w:val="3CF6FE18"/>
@@ -5413,7 +7007,7 @@
       </w:rPr>
     </w:lvl>
   </w:abstractNum>
-  <w:abstractNum w:abstractNumId="30" w15:restartNumberingAfterBreak="0">
+  <w:abstractNum w:abstractNumId="37" w15:restartNumberingAfterBreak="0">
     <w:nsid w:val="7C226B17"/>
     <w:multiLevelType w:val="hybridMultilevel"/>
     <w:tmpl w:val="316EBF58"/>
@@ -5526,7 +7120,7 @@
       </w:rPr>
     </w:lvl>
   </w:abstractNum>
-  <w:abstractNum w:abstractNumId="31" w15:restartNumberingAfterBreak="0">
+  <w:abstractNum w:abstractNumId="38" w15:restartNumberingAfterBreak="0">
     <w:nsid w:val="7C7324D3"/>
     <w:multiLevelType w:val="hybridMultilevel"/>
     <w:tmpl w:val="FBB601F2"/>
@@ -5640,100 +7234,121 @@
     </w:lvl>
   </w:abstractNum>
   <w:num w:numId="1" w16cid:durableId="1507473298">
+    <w:abstractNumId w:val="7"/>
+  </w:num>
+  <w:num w:numId="2" w16cid:durableId="1810004600">
     <w:abstractNumId w:val="5"/>
   </w:num>
-  <w:num w:numId="2" w16cid:durableId="1810004600">
+  <w:num w:numId="3" w16cid:durableId="1516307261">
+    <w:abstractNumId w:val="33"/>
+  </w:num>
+  <w:num w:numId="4" w16cid:durableId="263998001">
+    <w:abstractNumId w:val="36"/>
+  </w:num>
+  <w:num w:numId="5" w16cid:durableId="1694530711">
     <w:abstractNumId w:val="4"/>
   </w:num>
-  <w:num w:numId="3" w16cid:durableId="1516307261">
-    <w:abstractNumId w:val="27"/>
-  </w:num>
-  <w:num w:numId="4" w16cid:durableId="263998001">
-    <w:abstractNumId w:val="29"/>
-  </w:num>
-  <w:num w:numId="5" w16cid:durableId="1694530711">
-    <w:abstractNumId w:val="3"/>
-  </w:num>
   <w:num w:numId="6" w16cid:durableId="399212304">
-    <w:abstractNumId w:val="26"/>
+    <w:abstractNumId w:val="32"/>
   </w:num>
   <w:num w:numId="7" w16cid:durableId="1510755812">
-    <w:abstractNumId w:val="31"/>
+    <w:abstractNumId w:val="38"/>
   </w:num>
   <w:num w:numId="8" w16cid:durableId="401295270">
-    <w:abstractNumId w:val="28"/>
+    <w:abstractNumId w:val="34"/>
   </w:num>
   <w:num w:numId="9" w16cid:durableId="1237131580">
-    <w:abstractNumId w:val="16"/>
+    <w:abstractNumId w:val="21"/>
   </w:num>
   <w:num w:numId="10" w16cid:durableId="1815832771">
-    <w:abstractNumId w:val="19"/>
+    <w:abstractNumId w:val="25"/>
   </w:num>
   <w:num w:numId="11" w16cid:durableId="1210530553">
-    <w:abstractNumId w:val="10"/>
+    <w:abstractNumId w:val="13"/>
   </w:num>
   <w:num w:numId="12" w16cid:durableId="709888915">
-    <w:abstractNumId w:val="15"/>
+    <w:abstractNumId w:val="20"/>
   </w:num>
   <w:num w:numId="13" w16cid:durableId="1638875566">
     <w:abstractNumId w:val="0"/>
   </w:num>
   <w:num w:numId="14" w16cid:durableId="1857187464">
-    <w:abstractNumId w:val="11"/>
+    <w:abstractNumId w:val="14"/>
   </w:num>
   <w:num w:numId="15" w16cid:durableId="1398281611">
+    <w:abstractNumId w:val="12"/>
+  </w:num>
+  <w:num w:numId="16" w16cid:durableId="2101368299">
+    <w:abstractNumId w:val="31"/>
+  </w:num>
+  <w:num w:numId="17" w16cid:durableId="1383942363">
+    <w:abstractNumId w:val="18"/>
+  </w:num>
+  <w:num w:numId="18" w16cid:durableId="975914109">
+    <w:abstractNumId w:val="24"/>
+  </w:num>
+  <w:num w:numId="19" w16cid:durableId="707417816">
+    <w:abstractNumId w:val="28"/>
+  </w:num>
+  <w:num w:numId="20" w16cid:durableId="1331831440">
     <w:abstractNumId w:val="9"/>
   </w:num>
-  <w:num w:numId="16" w16cid:durableId="2101368299">
-    <w:abstractNumId w:val="25"/>
-  </w:num>
-  <w:num w:numId="17" w16cid:durableId="1383942363">
-    <w:abstractNumId w:val="14"/>
-  </w:num>
-  <w:num w:numId="18" w16cid:durableId="975914109">
-    <w:abstractNumId w:val="18"/>
-  </w:num>
-  <w:num w:numId="19" w16cid:durableId="707417816">
-    <w:abstractNumId w:val="22"/>
-  </w:num>
-  <w:num w:numId="20" w16cid:durableId="1331831440">
-    <w:abstractNumId w:val="7"/>
-  </w:num>
   <w:num w:numId="21" w16cid:durableId="1910534101">
-    <w:abstractNumId w:val="30"/>
+    <w:abstractNumId w:val="37"/>
   </w:num>
   <w:num w:numId="22" w16cid:durableId="124473379">
-    <w:abstractNumId w:val="8"/>
+    <w:abstractNumId w:val="10"/>
   </w:num>
   <w:num w:numId="23" w16cid:durableId="256406080">
-    <w:abstractNumId w:val="24"/>
+    <w:abstractNumId w:val="30"/>
   </w:num>
   <w:num w:numId="24" w16cid:durableId="1952279886">
     <w:abstractNumId w:val="1"/>
   </w:num>
   <w:num w:numId="25" w16cid:durableId="667830043">
-    <w:abstractNumId w:val="6"/>
+    <w:abstractNumId w:val="8"/>
   </w:num>
   <w:num w:numId="26" w16cid:durableId="200168938">
-    <w:abstractNumId w:val="17"/>
+    <w:abstractNumId w:val="22"/>
   </w:num>
   <w:num w:numId="27" w16cid:durableId="240065754">
-    <w:abstractNumId w:val="13"/>
+    <w:abstractNumId w:val="16"/>
   </w:num>
   <w:num w:numId="28" w16cid:durableId="1593396341">
-    <w:abstractNumId w:val="23"/>
+    <w:abstractNumId w:val="29"/>
   </w:num>
   <w:num w:numId="29" w16cid:durableId="36511375">
-    <w:abstractNumId w:val="21"/>
+    <w:abstractNumId w:val="27"/>
   </w:num>
   <w:num w:numId="30" w16cid:durableId="853804131">
     <w:abstractNumId w:val="2"/>
   </w:num>
   <w:num w:numId="31" w16cid:durableId="1256211548">
-    <w:abstractNumId w:val="20"/>
+    <w:abstractNumId w:val="26"/>
   </w:num>
   <w:num w:numId="32" w16cid:durableId="1482887219">
-    <w:abstractNumId w:val="12"/>
+    <w:abstractNumId w:val="15"/>
+  </w:num>
+  <w:num w:numId="33" w16cid:durableId="1694575690">
+    <w:abstractNumId w:val="23"/>
+  </w:num>
+  <w:num w:numId="34" w16cid:durableId="1022703125">
+    <w:abstractNumId w:val="6"/>
+  </w:num>
+  <w:num w:numId="35" w16cid:durableId="1913083003">
+    <w:abstractNumId w:val="19"/>
+  </w:num>
+  <w:num w:numId="36" w16cid:durableId="814685219">
+    <w:abstractNumId w:val="17"/>
+  </w:num>
+  <w:num w:numId="37" w16cid:durableId="615452742">
+    <w:abstractNumId w:val="3"/>
+  </w:num>
+  <w:num w:numId="38" w16cid:durableId="935285120">
+    <w:abstractNumId w:val="35"/>
+  </w:num>
+  <w:num w:numId="39" w16cid:durableId="1114598077">
+    <w:abstractNumId w:val="11"/>
   </w:num>
   <w:numIdMacAtCleanup w:val="13"/>
 </w:numbering>
@@ -7272,6 +8887,19 @@
       <w:iCs/>
     </w:rPr>
   </w:style>
+  <w:style w:type="paragraph" w:styleId="TDC3">
+    <w:name w:val="toc 3"/>
+    <w:basedOn w:val="Normal"/>
+    <w:next w:val="Normal"/>
+    <w:autoRedefine/>
+    <w:uiPriority w:val="39"/>
+    <w:unhideWhenUsed/>
+    <w:rsid w:val="00526C48"/>
+    <w:pPr>
+      <w:spacing w:after="100"/>
+      <w:ind w:left="480"/>
+    </w:pPr>
+  </w:style>
 </w:styles>
 </file>
 

</xml_diff>